<commit_message>
Inicial PagBank: consolida as três minutas (fatos do PROCON, precedentes STJ/TJPI, rito do Juizado)
Co-Authored-By: Claude Opus 5.5 <noreply@anthropic.com>
Claude-Session: https://claude.ai/code/session_01SFjamS7EZogQCva5nedbPz
</commit_message>
<xml_diff>
--- a/Inicial - Pedro Acelino e Moura x PagBank/Petição inicial - Pedro Acelino e Moura x PagBank.docx
+++ b/Inicial - Pedro Acelino e Moura x PagBank/Petição inicial - Pedro Acelino e Moura x PagBank.docx
@@ -59,7 +59,7 @@
         <w:t xml:space="preserve">DEPÓSITO BETS BAR</w:t>
       </w:r>
       <w:r>
-        <w:t xml:space="preserve">, pessoa jurídica de direito privado inscrita no CNPJ sob o nº 42.828.031/0001-85, com sede na Rua Rio Grande do Sul, nº 3389, bairro São Miguel, Miguel Alves-PI, CEP: 64.130-000, neste ato representada por seu titular, PEDRO ACELINO E MOURA, acima qualificado, por meio de seu advogado, ANTÔNIO DE PÁDUA SANTOS NETO, inscrito nos quadros da OAB-PI sob o nº 21.320, constituído mediante procuração em anexo, com endereço físico na Rua Rio Grande do Sul, nº 1641, bairro São Miguel, Miguel Alves-PI, CEP: 64.130-000, e eletrônico: paduanetojus@gmail.com, vêm, à presença de Vossa Excelência, propor a presente</w:t>
+        <w:t xml:space="preserve">, inscrita no CNPJ sob o nº 42.828.031/0001-85, com sede na Rua Rio Grande do Sul, nº 3389, bairro São Miguel, Miguel Alves-PI, CEP: 64.130-000, neste ato representada por seu titular, PEDRO ACELINO E MOURA, acima qualificado, por meio de seu advogado, ANTÔNIO DE PÁDUA SANTOS NETO, inscrito nos quadros da OAB-PI sob o nº 21.320, constituído mediante procuração em anexo, com endereço físico na Rua Rio Grande do Sul, nº 1641, bairro São Miguel, Miguel Alves-PI, CEP: 64.130-000, e eletrônico: paduanetojus@gmail.com, vêm, à presença de Vossa Excelência, propor a presente</w:t>
       </w:r>
     </w:p>
     <w:p>
@@ -77,7 +77,7 @@
           <w:b/>
           <w:bCs/>
         </w:rPr>
-        <w:t xml:space="preserve">AÇÃO DE OBRIGAÇÃO DE FAZER C/C RESTITUIÇÃO DE VALORES E INDENIZAÇÃO POR DANOS MORAIS, COM PEDIDO DE TUTELA DE URGÊNCIA</w:t>
+        <w:t xml:space="preserve">AÇÃO DE COBRANÇA C/C OBRIGAÇÃO DE FAZER E INDENIZAÇÃO POR DANOS MORAIS, COM PEDIDO DE TUTELA DE URGÊNCIA</w:t>
       </w:r>
     </w:p>
     <w:p>
@@ -102,7 +102,7 @@
         <w:t xml:space="preserve">PAGSEGURO INTERNET INSTITUIÇÃO DE PAGAMENTO S.A. (PAGBANK)</w:t>
       </w:r>
       <w:r>
-        <w:t xml:space="preserve">, pessoa jurídica de direito privado inscrita no CNPJ sob o nº 08.561.701/0001-01, com sede na Avenida Brigadeiro Faria Lima, nº 1384, 4º andar, Jardim Paulistano, São Paulo-SP, CEP: 01.451-001, pelos fundamentos fáticos e jurídicos a seguir aduzidos.</w:t>
+        <w:t xml:space="preserve">, pessoa jurídica de direito privado inscrita no CNPJ sob o nº 08.561.701/0001-01, com sede na Avenida Brigadeiro Faria Lima, nº 1.384, 4º andar, Jardim Paulistano, São Paulo-SP, CEP: 01.451-001, pelos fundamentos fáticos e jurídicos a seguir aduzidos.</w:t>
       </w:r>
     </w:p>
     <w:p>
@@ -160,7 +160,7 @@
         <w:jc w:val="both"/>
       </w:pPr>
       <w:r>
-        <w:t xml:space="preserve">A causa, de menor complexidade e de valor inferior a quarenta salários mínimos, comporta processamento sob o rito da Lei nº 9.099/1995 (art. 3º, I). A segunda autora, empresária individual enquadrada como microempresa, possui legitimidade para propor ação perante o Juizado Especial Cível, nos termos do </w:t>
+        <w:t xml:space="preserve">Os autores optam pelo procedimento da Lei nº 9.099/1995. A causa é de menor complexidade e seu valor não excede quarenta salários mínimos (art. 3º, I). A segunda autora, empresária individual enquadrada como microempresa, tem legitimidade para propor ação perante o Juizado Especial Cível, nos termos do </w:t>
       </w:r>
       <w:r>
         <w:rPr>
@@ -182,7 +182,7 @@
         <w:jc w:val="both"/>
       </w:pPr>
       <w:r>
-        <w:t xml:space="preserve">O litisconsórcio ativo justifica-se porque ambas as contas, a de pessoa física e a de pessoa jurídica, foram encerradas pela ré no mesmo ato, na mesma data e pela mesma causa, havendo comunhão de direitos e identidade de fundamento (art. 113, I e III, do CPC).</w:t>
+        <w:t xml:space="preserve">O litisconsórcio ativo justifica-se porque ambas as contas, a de pessoa física e a de pessoa jurídica, foram encerradas pela ré no mesmo ato, na mesma data e pelo mesmo fundamento genérico, havendo comunhão de direitos e identidade de causa de pedir (art. 113, I e III, do CPC).</w:t>
       </w:r>
     </w:p>
     <w:p>
@@ -220,7 +220,7 @@
         <w:jc w:val="both"/>
       </w:pPr>
       <w:r>
-        <w:t xml:space="preserve">Os autores manifestam interesse na audiência de conciliação (arts. 21 e 22 da Lei nº 9.099/1995) e requerem, desde já, sua realização por videoconferência, nos termos do § 2º do art. 22 da mesma lei, considerando que a ré tem sede em outro Estado.</w:t>
+        <w:t xml:space="preserve">Os autores manifestam interesse na audiência de conciliação (arts. 21 e 22 da Lei nº 9.099/1995) e requerem, desde já, sua realização por videoconferência (art. 22, § 2º), considerando que a ré tem sede em outro Estado.</w:t>
       </w:r>
     </w:p>
     <w:p>
@@ -250,17 +250,17 @@
         <w:jc w:val="both"/>
       </w:pPr>
       <w:r>
-        <w:t xml:space="preserve">Os autores mantinham, desde aproximadamente o ano de 2023, duas contas na instituição ré (PagBank): uma em nome da pessoa física, Pedro Acelino e Moura, e outra em nome da pessoa jurídica, Pedro Acelino e Moura ME (Depósito Bets Bar), utilizada para movimentar as receitas do estabelecimento comercial.</w:t>
-      </w:r>
-    </w:p>
-    <w:p>
-      <w:pPr>
-        <w:spacing w:after="60" w:line="360"/>
-        <w:ind w:firstLine="850"/>
-        <w:jc w:val="both"/>
-      </w:pPr>
-      <w:r>
-        <w:t xml:space="preserve">Em </w:t>
+        <w:t xml:space="preserve">Os autores mantinham, desde 2023, relação contratual com a ré (PagBank), por meio de duas contas: uma de pessoa física, em nome de Pedro Acelino e Moura, e outra de pessoa jurídica, em nome de Pedro Acelino e Moura ME (Depósito Bets Bar), utilizada para movimentar as receitas do estabelecimento comercial.</w:t>
+      </w:r>
+    </w:p>
+    <w:p>
+      <w:pPr>
+        <w:spacing w:after="60" w:line="360"/>
+        <w:ind w:firstLine="850"/>
+        <w:jc w:val="both"/>
+      </w:pPr>
+      <w:r>
+        <w:t xml:space="preserve">As contas eram utilizadas de forma regular e contínua, sem atraso, inadimplência, violação contratual ou prática ilícita. Ainda assim, em </w:t>
       </w:r>
       <w:r>
         <w:rPr>
@@ -269,10 +269,10 @@
           <w:u w:val="single"/>
           <w:shd w:fill="CFE2F3" w:color="auto" w:val="clear"/>
         </w:rPr>
-        <w:t xml:space="preserve">04/11/2024, ambas as contas foram encerradas unilateralmente pela ré</w:t>
-      </w:r>
-      <w:r>
-        <w:t xml:space="preserve">, sem que os autores tivessem sido previamente comunicados e, sobretudo, </w:t>
+        <w:t xml:space="preserve">04/11/2024, a ré encerrou unilateralmente ambas as contas</w:t>
+      </w:r>
+      <w:r>
+        <w:t xml:space="preserve">, sem comunicação prévia e sem justificativa adequada, impedindo o acesso aos saldos existentes e </w:t>
       </w:r>
       <w:r>
         <w:rPr>
@@ -281,30 +281,20 @@
           <w:u w:val="single"/>
           <w:shd w:fill="CFE2F3" w:color="auto" w:val="clear"/>
         </w:rPr>
-        <w:t xml:space="preserve">sem que lhes fosse oferecida qualquer forma de devolução dos saldos</w:t>
-      </w:r>
-      <w:r>
-        <w:t xml:space="preserve"> que nelas se encontravam depositados. Desde então, os autores perderam o acesso aos aplicativos, aos extratos e aos valores que lhes pertencem.</w:t>
-      </w:r>
-    </w:p>
-    <w:p>
-      <w:pPr>
-        <w:spacing w:after="60" w:line="360"/>
-        <w:ind w:firstLine="850"/>
-        <w:jc w:val="both"/>
-      </w:pPr>
-      <w:r>
-        <w:t xml:space="preserve">Buscando resolver a questão de forma amigável, o autor entrou em contato com a ré por telefone em diversas oportunidades. Em todas elas, os atendentes limitaram-se a orientá-lo a aguardar o recebimento de um e-mail, que jamais trouxe solução: os saldos não foram restituídos, nem foi indicada data ou procedimento para sua liberação.</w:t>
-      </w:r>
-    </w:p>
-    <w:p>
-      <w:pPr>
-        <w:spacing w:after="60" w:line="360"/>
-        <w:ind w:firstLine="850"/>
-        <w:jc w:val="both"/>
-      </w:pPr>
-      <w:r>
-        <w:t xml:space="preserve">Diante da demora, o autor formalizou reclamação perante o </w:t>
+        <w:t xml:space="preserve">deixando de oferecer qualquer meio para a devolução dos valores</w:t>
+      </w:r>
+      <w:r>
+        <w:t xml:space="preserve">. Desde então, os autores não têm acesso aos aplicativos, aos extratos nem aos recursos que lhes pertencem.</w:t>
+      </w:r>
+    </w:p>
+    <w:p>
+      <w:pPr>
+        <w:spacing w:after="60" w:line="360"/>
+        <w:ind w:firstLine="850"/>
+        <w:jc w:val="both"/>
+      </w:pPr>
+      <w:r>
+        <w:t xml:space="preserve">Os autores </w:t>
       </w:r>
       <w:r>
         <w:rPr>
@@ -313,10 +303,20 @@
           <w:u w:val="single"/>
           <w:shd w:fill="CFE2F3" w:color="auto" w:val="clear"/>
         </w:rPr>
-        <w:t xml:space="preserve">PROCON itinerante de Miguel Alves-PI</w:t>
-      </w:r>
-      <w:r>
-        <w:t xml:space="preserve">. Em resposta, a ré apresentou justificativa vaga e genérica, invocando suposto direito de reter os saldos, sem indicar fato concreto, débito, ordem judicial ou procedimento investigatório que a autorizasse. Ressalte-se que </w:t>
+        <w:t xml:space="preserve">não possuem nenhuma dívida, débito ou obrigação pendente perante a ré</w:t>
+      </w:r>
+      <w:r>
+        <w:t xml:space="preserve"> que justificasse o encerramento ou a retenção. Na tentativa de resolver a questão administrativamente, o autor contatou o atendimento telefônico da ré, sendo informado pelos atendentes de que deveria “aguardar o recebimento de um e-mail”, sem que a instituição estabelecesse prazo ou oferecesse solução concreta.</w:t>
+      </w:r>
+    </w:p>
+    <w:p>
+      <w:pPr>
+        <w:spacing w:after="60" w:line="360"/>
+        <w:ind w:firstLine="850"/>
+        <w:jc w:val="both"/>
+      </w:pPr>
+      <w:r>
+        <w:t xml:space="preserve">Diante da demora, o autor formalizou reclamação perante o </w:t>
       </w:r>
       <w:r>
         <w:rPr>
@@ -325,20 +325,42 @@
           <w:u w:val="single"/>
           <w:shd w:fill="CFE2F3" w:color="auto" w:val="clear"/>
         </w:rPr>
-        <w:t xml:space="preserve">os autores não possuem nenhuma dívida junto à ré</w:t>
-      </w:r>
-      <w:r>
-        <w:t xml:space="preserve">.</w:t>
-      </w:r>
-    </w:p>
-    <w:p>
-      <w:pPr>
-        <w:spacing w:after="60" w:line="360"/>
-        <w:ind w:firstLine="850"/>
-        <w:jc w:val="both"/>
-      </w:pPr>
-      <w:r>
-        <w:t xml:space="preserve">Em razão do tempo transcorrido e do bloqueio integral do acesso às contas, os autores não dispõem dos extratos e não conseguem precisar o montante retido, estimando que a soma dos saldos gire em torno de </w:t>
+        <w:t xml:space="preserve">PROCON itinerante de Miguel Alves-PI (protocolo nº 2503002600200036301)</w:t>
+      </w:r>
+      <w:r>
+        <w:t xml:space="preserve">. Na resposta, datada de 20/03/2025, a ré não solucionou a controvérsia e manteve-se genérica quanto aos fundamentos da retenção. Na oportunidade, a ré:</w:t>
+      </w:r>
+    </w:p>
+    <w:p>
+      <w:pPr>
+        <w:tabs>
+          <w:tab w:val="left" w:pos="1000"/>
+        </w:tabs>
+        <w:spacing w:after="60" w:line="360"/>
+        <w:ind w:left="1000" w:hanging="400"/>
+        <w:jc w:val="both"/>
+      </w:pPr>
+      <w:r>
+        <w:t xml:space="preserve">a)	</w:t>
+      </w:r>
+      <w:r>
+        <w:t xml:space="preserve">limitou-se a mencionar, de forma vaga, a adoção de “medidas de segurança” e a existência de “indício de ilicitude”, sem indicar a conduta concreta que teria motivado o bloqueio;</w:t>
+      </w:r>
+    </w:p>
+    <w:p>
+      <w:pPr>
+        <w:tabs>
+          <w:tab w:val="left" w:pos="1000"/>
+        </w:tabs>
+        <w:spacing w:after="60" w:line="360"/>
+        <w:ind w:left="1000" w:hanging="400"/>
+        <w:jc w:val="both"/>
+      </w:pPr>
+      <w:r>
+        <w:t xml:space="preserve">b)	</w:t>
+      </w:r>
+      <w:r>
+        <w:t xml:space="preserve">reconheceu expressamente que </w:t>
       </w:r>
       <w:r>
         <w:rPr>
@@ -347,6 +369,60 @@
           <w:u w:val="single"/>
           <w:shd w:fill="CFE2F3" w:color="auto" w:val="clear"/>
         </w:rPr>
+        <w:t xml:space="preserve">“até o presente momento não é possível desbloquear os valores”</w:t>
+      </w:r>
+      <w:r>
+        <w:t xml:space="preserve">, sem apresentar solução para a liberação do numerário;</w:t>
+      </w:r>
+    </w:p>
+    <w:p>
+      <w:pPr>
+        <w:tabs>
+          <w:tab w:val="left" w:pos="1000"/>
+        </w:tabs>
+        <w:spacing w:after="60" w:line="360"/>
+        <w:ind w:left="1000" w:hanging="400"/>
+        <w:jc w:val="both"/>
+      </w:pPr>
+      <w:r>
+        <w:t xml:space="preserve">c)	</w:t>
+      </w:r>
+      <w:r>
+        <w:t xml:space="preserve">indicou apenas o canal “SOS BLOQUEIO” como meio de atendimento, sem providência concreta capaz de solucionar a retenção; e</w:t>
+      </w:r>
+    </w:p>
+    <w:p>
+      <w:pPr>
+        <w:tabs>
+          <w:tab w:val="left" w:pos="1000"/>
+        </w:tabs>
+        <w:spacing w:after="60" w:line="360"/>
+        <w:ind w:left="1000" w:hanging="400"/>
+        <w:jc w:val="both"/>
+      </w:pPr>
+      <w:r>
+        <w:t xml:space="preserve">d)	</w:t>
+      </w:r>
+      <w:r>
+        <w:t xml:space="preserve">amparou a manutenção do bloqueio em disposições contratuais genéricas (cláusulas 5.10, 5.15.3 e 14.4), sem individualizar a conduta atribuída aos autores, a razão específica da restrição ou qualquer prazo para regularização.</w:t>
+      </w:r>
+    </w:p>
+    <w:p>
+      <w:pPr>
+        <w:spacing w:after="60" w:line="360"/>
+        <w:ind w:firstLine="850"/>
+        <w:jc w:val="both"/>
+      </w:pPr>
+      <w:r>
+        <w:t xml:space="preserve">Passados quase dois anos do encerramento, os autores continuam sem acesso às contas, sem os saldos e sem informação sobre o valor retido. Por estarem bloqueados os extratos, não conseguem apurar com exatidão o montante existente na data do encerramento, estimando que a soma dos saldos gire em torno de </w:t>
+      </w:r>
+      <w:r>
+        <w:rPr>
+          <w:b/>
+          <w:bCs/>
+          <w:u w:val="single"/>
+          <w:shd w:fill="CFE2F3" w:color="auto" w:val="clear"/>
+        </w:rPr>
         <w:t xml:space="preserve">R$ 3.500,00 (três mil e quinhentos reais)</w:t>
       </w:r>
       <w:r>
@@ -360,7 +436,7 @@
         <w:jc w:val="both"/>
       </w:pPr>
       <w:r>
-        <w:t xml:space="preserve">Passados quase dois anos do encerramento, os valores continuam retidos, sem qualquer justificativa idônea, o que torna necessário o ajuizamento da presente ação.</w:t>
+        <w:t xml:space="preserve">Esgotada sem êxito a via administrativa, não resta alternativa senão o ajuizamento da presente ação.</w:t>
       </w:r>
     </w:p>
     <w:p>
@@ -418,7 +494,7 @@
         <w:jc w:val="both"/>
       </w:pPr>
       <w:r>
-        <w:t xml:space="preserve">A ré é instituição de pagamento que oferece serviços financeiros no mercado de consumo, enquadrando-se no conceito de fornecedora (art. 3º, § 2º, do CDC). Nos termos da </w:t>
+        <w:t xml:space="preserve">A ré é instituição de pagamento autorizada pelo Banco Central do Brasil que oferece serviços financeiros no mercado de consumo, enquadrando-se no conceito de fornecedora (art. 3º, § 2º, do CDC). Nos termos da </w:t>
       </w:r>
       <w:r>
         <w:rPr>
@@ -440,17 +516,17 @@
         <w:jc w:val="both"/>
       </w:pPr>
       <w:r>
-        <w:t xml:space="preserve">O primeiro autor é destinatário final dos serviços contratados. Quanto à segunda autora, microempresa de pequeno porte titularizada por pessoa natural, incide a teoria finalista mitigada, consolidada no Superior Tribunal de Justiça, que admite a aplicação do CDC à pessoa jurídica que demonstra vulnerabilidade técnica, jurídica ou econômica frente ao fornecedor, situação evidente diante de uma das maiores instituições de pagamento do país, que detém com exclusividade os registros das contas e impõe unilateralmente as condições do serviço.</w:t>
-      </w:r>
-    </w:p>
-    <w:p>
-      <w:pPr>
-        <w:spacing w:after="60" w:line="360"/>
-        <w:ind w:firstLine="850"/>
-        <w:jc w:val="both"/>
-      </w:pPr>
-      <w:r>
-        <w:t xml:space="preserve">Presentes a verossimilhança das alegações e a hipossuficiência técnica dos autores, que não têm acesso aos extratos das próprias contas, impõe-se a </w:t>
+        <w:t xml:space="preserve">O primeiro autor é destinatário final dos serviços contratados (art. 2º do CDC). Quanto à segunda autora, microempresa titularizada por pessoa natural, incide a teoria finalista mitigada, consolidada no Superior Tribunal de Justiça, que admite a aplicação do CDC à pessoa jurídica que demonstra vulnerabilidade técnica, jurídica ou econômica frente ao fornecedor, situação evidente diante de uma das maiores instituições de pagamento do país, que detém com exclusividade os registros das contas e impõe unilateralmente as condições do serviço.</w:t>
+      </w:r>
+    </w:p>
+    <w:p>
+      <w:pPr>
+        <w:spacing w:after="60" w:line="360"/>
+        <w:ind w:firstLine="850"/>
+        <w:jc w:val="both"/>
+      </w:pPr>
+      <w:r>
+        <w:t xml:space="preserve">A ré responde objetivamente pelos defeitos na prestação do serviço (art. 14 do CDC). Presentes a verossimilhança das alegações e a hipossuficiência técnica dos autores, que não têm acesso aos extratos das próprias contas, impõe-se a </w:t>
       </w:r>
       <w:r>
         <w:rPr>
@@ -462,7 +538,7 @@
         <w:t xml:space="preserve">inversão do ônus da prova</w:t>
       </w:r>
       <w:r>
-        <w:t xml:space="preserve"> (art. 6º, VIII, do CDC), cabendo à ré demonstrar os saldos existentes na data do encerramento, o motivo do encerramento, a comunicação prévia aos titulares e a destinação dada aos valores.</w:t>
+        <w:t xml:space="preserve"> (art. 6º, VIII, do CDC), cabendo à ré demonstrar os saldos existentes na data do encerramento, o motivo concreto do encerramento, a comunicação prévia aos titulares e a destinação dada aos valores.</w:t>
       </w:r>
     </w:p>
     <w:p>
@@ -490,39 +566,17 @@
           <w:i/>
           <w:iCs/>
         </w:rPr>
-        <w:t xml:space="preserve">Da ilicitude da retenção dos saldos:</w:t>
-      </w:r>
-    </w:p>
-    <w:p>
-      <w:pPr>
-        <w:spacing w:after="60" w:line="360"/>
-        <w:ind w:firstLine="850"/>
-        <w:jc w:val="both"/>
-      </w:pPr>
-      <w:r>
-        <w:t xml:space="preserve">Ainda que se admita, em tese, a possibilidade de a instituição encerrar unilateralmente o relacionamento contratual, mediante prévia e adequada notificação, tal faculdade </w:t>
-      </w:r>
-      <w:r>
-        <w:rPr>
-          <w:b/>
-          <w:bCs/>
-          <w:u w:val="single"/>
-          <w:shd w:fill="CFE2F3" w:color="auto" w:val="clear"/>
-        </w:rPr>
-        <w:t xml:space="preserve">não autoriza a apropriação dos recursos do cliente</w:t>
-      </w:r>
-      <w:r>
-        <w:t xml:space="preserve">. Encerrada a conta, cabe à instituição colocar o saldo à disposição do titular, conforme a regulamentação do Conselho Monetário Nacional e do Banco Central do Brasil sobre encerramento de contas de depósito e de pagamento (Resolução CMN nº 4.753/2019 e Resolução BCB nº 96/2021).</w:t>
-      </w:r>
-    </w:p>
-    <w:p>
-      <w:pPr>
-        <w:spacing w:after="60" w:line="360"/>
-        <w:ind w:firstLine="850"/>
-        <w:jc w:val="both"/>
-      </w:pPr>
-      <w:r>
-        <w:t xml:space="preserve">Mais do que isso, a lei que disciplina as instituições de pagamento estabelece que os recursos mantidos em contas de pagamento pertencem aos usuários e </w:t>
+        <w:t xml:space="preserve">Da titularidade dos recursos e da ilicitude da retenção:</w:t>
+      </w:r>
+    </w:p>
+    <w:p>
+      <w:pPr>
+        <w:spacing w:after="60" w:line="360"/>
+        <w:ind w:firstLine="850"/>
+        <w:jc w:val="both"/>
+      </w:pPr>
+      <w:r>
+        <w:t xml:space="preserve">A lei que disciplina as instituições de pagamento estabelece que os recursos mantidos em contas de pagamento pertencem aos usuários e </w:t>
       </w:r>
       <w:r>
         <w:rPr>
@@ -564,7 +618,17 @@
         <w:jc w:val="both"/>
       </w:pPr>
       <w:r>
-        <w:t xml:space="preserve">A ré, portanto, não tem título algum para reter os valores. Não há débito dos autores, ordem judicial de bloqueio, nem procedimento administrativo comunicado aos titulares. A justificativa genérica apresentada no PROCON não supre o dever de informação clara e adequada (art. 6º, III, do CDC), e a retenção de saldo por prazo indefinido configura vantagem manifestamente excessiva e prática abusiva (arts. 39, V, e 51, IV, do CDC), além de </w:t>
+        <w:t xml:space="preserve">Na mesma linha, a regulamentação do Banco Central sobre contas de pagamento (Resolução BCB nº 96/2021, art. 12) impõe à instituição, no encerramento da conta, o dever de comunicar ao titular a intenção de rescindir o contrato e de possibilitar a transferência do saldo remanescente para conta por ele indicada ou de colocá-lo à sua disposição. A ré fez o oposto: encerrou as contas e manteve os valores bloqueados, sem mecanismo algum para sua restituição.</w:t>
+      </w:r>
+    </w:p>
+    <w:p>
+      <w:pPr>
+        <w:spacing w:after="60" w:line="360"/>
+        <w:ind w:firstLine="850"/>
+        <w:jc w:val="both"/>
+      </w:pPr>
+      <w:r>
+        <w:t xml:space="preserve">No âmbito dos Juizados Especiais deste Estado, a 1ª Turma Recursal do TJPI firmou tese no sentido de que a retenção do saldo após o encerramento da conta caracteriza falha na prestação do serviço, </w:t>
       </w:r>
       <w:r>
         <w:rPr>
@@ -573,6 +637,48 @@
           <w:u w:val="single"/>
           <w:shd w:fill="CFE2F3" w:color="auto" w:val="clear"/>
         </w:rPr>
+        <w:t xml:space="preserve">independentemente da legitimidade do bloqueio preventivo e do encerramento contratual</w:t>
+      </w:r>
+      <w:r>
+        <w:t xml:space="preserve">, e configura dano moral indenizável:</w:t>
+      </w:r>
+    </w:p>
+    <w:p>
+      <w:pPr>
+        <w:pBdr>
+          <w:top w:val="single" w:color="9AA0A6" w:sz="4" w:space="6"/>
+          <w:bottom w:val="single" w:color="9AA0A6" w:sz="4" w:space="6"/>
+        </w:pBdr>
+        <w:spacing w:after="200" w:before="160" w:line="240"/>
+        <w:ind w:left="2270" w:right="570"/>
+        <w:jc w:val="both"/>
+      </w:pPr>
+      <w:r>
+        <w:rPr>
+          <w:i/>
+          <w:iCs/>
+          <w:sz w:val="18"/>
+          <w:szCs w:val="18"/>
+        </w:rPr>
+        <w:t xml:space="preserve">DIREITO DO CONSUMIDOR E PROCESSUAL CIVIL. RECURSO INOMINADO. INSTITUIÇÃO FINANCEIRA. BLOQUEIO PREVENTIVO DE CONTA BANCÁRIA. ENCERRAMENTO UNILATERAL DA RELAÇÃO CONTRATUAL. RETENÇÃO DE SALDO REMANESCENTE. FALHA NA PRESTAÇÃO DO SERVIÇO. DANOS MORAIS. MANUTENÇÃO DA SENTENÇA. RECURSO CONHECIDO E DESPROVIDO. [...] 6. A retenção dos valores após o encerramento da conta caracteriza falha na prestação do serviço bancário, independentemente da legitimidade do bloqueio preventivo e do encerramento contratual. 7. A privação injustificada do acesso a recursos financeiros de titularidade do consumidor ultrapassa o mero dissabor cotidiano e legitima a compensação por danos morais. [...] Tese de julgamento: A instituição financeira responde pela falha na prestação do serviço quando retém saldo de correntista por período prolongado após o encerramento da conta bancária. A devolução dos valores apenas no curso da demanda não afasta a caracterização da falha do serviço anteriormente verificada. A retenção indevida de recursos financeiros do consumidor configura dano moral indenizável. [...] (TJ-PI - Recurso Inominado Cível nº 0800939-21.2025.8.18.0057, Rel. Paulo Roberto de Araújo Barros, 1ª Turma Recursal, julgado em 08/07/2026)</w:t>
+      </w:r>
+    </w:p>
+    <w:p>
+      <w:pPr>
+        <w:spacing w:after="60" w:line="360"/>
+        <w:ind w:firstLine="850"/>
+        <w:jc w:val="both"/>
+      </w:pPr>
+      <w:r>
+        <w:t xml:space="preserve">A ré, portanto, não tem título para reter os valores. Não há débito dos autores, ordem judicial de bloqueio, nem procedimento comunicado aos titulares com indicação da conduta imputada. A retenção por prazo indefinido configura vantagem manifestamente excessiva e prática abusiva (arts. 39, V, e 51, IV, do CDC), além de </w:t>
+      </w:r>
+      <w:r>
+        <w:rPr>
+          <w:b/>
+          <w:bCs/>
+          <w:u w:val="single"/>
+          <w:shd w:fill="CFE2F3" w:color="auto" w:val="clear"/>
+        </w:rPr>
         <w:t xml:space="preserve">enriquecimento sem causa</w:t>
       </w:r>
       <w:r>
@@ -586,27 +692,19 @@
         <w:jc w:val="both"/>
       </w:pPr>
       <w:r>
-        <w:t xml:space="preserve">Eventual alegação de “análise de segurança” ou de suspeita de irregularidade, além de não ter sido comunicada de forma concreta aos autores, não se sustenta após quase dois anos: medida preventiva dessa natureza é, por definição, provisória e deve ser concluída em prazo razoável, com a devolução dos valores ou com a demonstração objetiva de sua origem ilícita, o que jamais ocorreu.</w:t>
-      </w:r>
-    </w:p>
-    <w:p>
-      <w:pPr>
-        <w:spacing w:after="60" w:line="360"/>
-        <w:ind w:firstLine="850"/>
-        <w:jc w:val="both"/>
-      </w:pPr>
-      <w:r>
-        <w:t xml:space="preserve">Trata-se de falha na prestação do serviço, pela qual a ré responde objetivamente (art. 14 do CDC). Mesmo que afastada a incidência do diploma consumerista em relação à segunda autora, a conclusão seria a mesma, pois a retenção de valores alheios sem causa jurídica configura ato ilícito e enriquecimento sem causa, nos termos dos arts. 186, 884 e 927 do Código Civil.</w:t>
-      </w:r>
-    </w:p>
-    <w:p>
-      <w:pPr>
-        <w:spacing w:after="60" w:line="360"/>
-        <w:ind w:firstLine="850"/>
-        <w:jc w:val="both"/>
-      </w:pPr>
-      <w:r>
-        <w:t xml:space="preserve">[Inserir ementa de precedente do TJPI ou das Turmas Recursais do Piauí sobre retenção de saldo após encerramento unilateral de conta pelo PagBank/PagSeguro.]</w:t>
+        <w:t xml:space="preserve">O Superior Tribunal de Justiça já analisou controvérsia envolvendo a própria ré. No </w:t>
+      </w:r>
+      <w:r>
+        <w:rPr>
+          <w:b/>
+          <w:bCs/>
+          <w:u w:val="single"/>
+          <w:shd w:fill="CFE2F3" w:color="auto" w:val="clear"/>
+        </w:rPr>
+        <w:t xml:space="preserve">AgInt no AREsp nº 2.607.102/GO</w:t>
+      </w:r>
+      <w:r>
+        <w:t xml:space="preserve"> (Rel. Min. Humberto Martins, Terceira Turma, julgado em 22/04/2026, DJe 27/04/2026), a Corte manteve acórdão que, embora reconhecesse a validade genérica de cláusulas de bloqueio para apuração de irregularidades, considerou abusiva a retenção por período superior a 90 dias, ante a ausência de comprovação dos estornos que justificariam a medida, determinando a restituição dos valores. No caso dos autos, a situação é mais grave: os valores estão indisponíveis há quase dois anos, sem justificativa concreta, comprovação de fraude, indicação de estorno ou prazo para liberação.</w:t>
       </w:r>
     </w:p>
     <w:p>
@@ -634,37 +732,59 @@
           <w:i/>
           <w:iCs/>
         </w:rPr>
-        <w:t xml:space="preserve">Da restituição dos saldos e da exibição dos extratos:</w:t>
-      </w:r>
-    </w:p>
-    <w:p>
-      <w:pPr>
-        <w:spacing w:after="60" w:line="360"/>
-        <w:ind w:firstLine="850"/>
-        <w:jc w:val="both"/>
-      </w:pPr>
-      <w:r>
-        <w:t xml:space="preserve">Os autores têm direito à restituição integral dos saldos existentes em ambas as contas na data do encerramento, com correção monetária desde 04/11/2024 e juros de mora desde a citação (arts. 389, 405 e 406 do Código Civil, na redação da Lei nº 14.905/2024).</w:t>
-      </w:r>
-    </w:p>
-    <w:p>
-      <w:pPr>
-        <w:spacing w:after="60" w:line="360"/>
-        <w:ind w:firstLine="850"/>
-        <w:jc w:val="both"/>
-      </w:pPr>
-      <w:r>
-        <w:t xml:space="preserve">Como o valor exato depende de documentos que estão exclusivamente em poder da ré, o pedido é formulado de forma genérica quanto ao montante, o que é expressamente admitido quando não for possível determinar, desde logo, a extensão da obrigação (art. 14, § 2º, da Lei nº 9.099/1995 e art. 324, § 1º, III, do CPC), indicando-se como estimativa o valor de R$ 3.500,00.</w:t>
-      </w:r>
-    </w:p>
-    <w:p>
-      <w:pPr>
-        <w:spacing w:after="60" w:line="360"/>
-        <w:ind w:firstLine="850"/>
-        <w:jc w:val="both"/>
-      </w:pPr>
-      <w:r>
-        <w:t xml:space="preserve">Requer-se, ainda, que a ré seja compelida a exibir os extratos completos das duas contas, desde a abertura até o encerramento, bem como os documentos relativos ao encerramento (arts. 396 e 399, I e III, do CPC). Em caso de recusa ou omissão, deverão ser admitidos como verdadeiros os fatos que os autores pretendem provar, prevalecendo o valor estimado na inicial (art. 400 do CPC).</w:t>
+        <w:t xml:space="preserve">Do abuso de direito e da interpretação das cláusulas contratuais:</w:t>
+      </w:r>
+    </w:p>
+    <w:p>
+      <w:pPr>
+        <w:spacing w:after="60" w:line="360"/>
+        <w:ind w:firstLine="850"/>
+        <w:jc w:val="both"/>
+      </w:pPr>
+      <w:r>
+        <w:t xml:space="preserve">Não se nega que a ré possa, nos termos do contrato, adotar medidas de segurança ou encerrar a relação contratual em determinadas hipóteses. O exercício dessa prerrogativa, porém, não é absoluto e </w:t>
+      </w:r>
+      <w:r>
+        <w:rPr>
+          <w:b/>
+          <w:bCs/>
+          <w:u w:val="single"/>
+          <w:shd w:fill="CFE2F3" w:color="auto" w:val="clear"/>
+        </w:rPr>
+        <w:t xml:space="preserve">não autoriza a apropriação dos recursos do cliente</w:t>
+      </w:r>
+      <w:r>
+        <w:t xml:space="preserve">. Comete ato ilícito quem exerce um direito excedendo manifestamente os limites impostos pelo seu fim econômico ou social e pela boa-fé (art. 187 do Código Civil).</w:t>
+      </w:r>
+    </w:p>
+    <w:p>
+      <w:pPr>
+        <w:spacing w:after="60" w:line="360"/>
+        <w:ind w:firstLine="850"/>
+        <w:jc w:val="both"/>
+      </w:pPr>
+      <w:r>
+        <w:t xml:space="preserve">O abuso decorre do conjunto das circunstâncias: (i) ausência de indicação do motivo concreto da restrição; (ii) encerramento sem comunicação prévia; (iii) manutenção do bloqueio por quase dois anos, sem prazo definido; e (iv) confissão da própria ré, perante o PROCON, de que “não é possível desbloquear os valores”, sem apresentar alternativa para restituí-los. A menção genérica a “medidas de segurança” e “indício de ilicitude” não supre o dever de informação clara e adequada (art. 6º, III, do CDC).</w:t>
+      </w:r>
+    </w:p>
+    <w:p>
+      <w:pPr>
+        <w:spacing w:after="60" w:line="360"/>
+        <w:ind w:firstLine="850"/>
+        <w:jc w:val="both"/>
+      </w:pPr>
+      <w:r>
+        <w:t xml:space="preserve">As cláusulas 5.10, 5.15.3 e 14.4, invocadas pela ré, não podem ser interpretadas de forma absoluta. Sua aplicação deve observar a boa-fé objetiva e a função social do contrato (arts. 421 e 422 do Código Civil) e, nos termos do art. 47 do CDC, ser interpretada da maneira mais favorável ao consumidor, não se prestando a legitimar a retenção indefinida de valores de titularidade dos autores.</w:t>
+      </w:r>
+    </w:p>
+    <w:p>
+      <w:pPr>
+        <w:spacing w:after="60" w:line="360"/>
+        <w:ind w:firstLine="850"/>
+        <w:jc w:val="both"/>
+      </w:pPr>
+      <w:r>
+        <w:t xml:space="preserve">Mesmo que afastada a incidência do diploma consumerista em relação à segunda autora, a conclusão seria a mesma, pois a retenção de valores alheios sem causa jurídica configura ato ilícito e enriquecimento sem causa (arts. 186, 187, 884 e 927 do Código Civil).</w:t>
       </w:r>
     </w:p>
     <w:p>
@@ -692,6 +812,64 @@
           <w:i/>
           <w:iCs/>
         </w:rPr>
+        <w:t xml:space="preserve">Da restituição dos saldos e da exibição dos extratos:</w:t>
+      </w:r>
+    </w:p>
+    <w:p>
+      <w:pPr>
+        <w:spacing w:after="60" w:line="360"/>
+        <w:ind w:firstLine="850"/>
+        <w:jc w:val="both"/>
+      </w:pPr>
+      <w:r>
+        <w:t xml:space="preserve">Os autores têm direito à restituição integral dos saldos existentes em ambas as contas na data do encerramento, com correção monetária desde 04/11/2024 e juros de mora desde a citação (arts. 389, 405 e 406 do Código Civil, na redação da Lei nº 14.905/2024).</w:t>
+      </w:r>
+    </w:p>
+    <w:p>
+      <w:pPr>
+        <w:spacing w:after="60" w:line="360"/>
+        <w:ind w:firstLine="850"/>
+        <w:jc w:val="both"/>
+      </w:pPr>
+      <w:r>
+        <w:t xml:space="preserve">Como o valor exato depende de documentos que estão exclusivamente em poder da ré, o pedido é formulado de forma genérica quanto ao montante, o que é admitido quando não for possível determinar, desde logo, a extensão da obrigação (art. 14, § 2º, da Lei nº 9.099/1995 e art. 324, § 1º, III, do CPC), indicando-se como estimativa o valor de R$ 3.500,00.</w:t>
+      </w:r>
+    </w:p>
+    <w:p>
+      <w:pPr>
+        <w:spacing w:after="60" w:line="360"/>
+        <w:ind w:firstLine="850"/>
+        <w:jc w:val="both"/>
+      </w:pPr>
+      <w:r>
+        <w:t xml:space="preserve">Requer-se, ainda, que a ré seja compelida a exibir os extratos completos das duas contas, desde a abertura até o encerramento, bem como os documentos relativos ao bloqueio e ao encerramento (arts. 396 e 399, I e III, do CPC). Em caso de recusa ou omissão, deverão ser admitidos como verdadeiros os fatos que os autores pretendem provar, prevalecendo o valor estimado nesta inicial (art. 400 do CPC).</w:t>
+      </w:r>
+    </w:p>
+    <w:p>
+      <w:pPr>
+        <w:keepNext/>
+        <w:tabs>
+          <w:tab w:val="left" w:pos="700"/>
+        </w:tabs>
+        <w:spacing w:after="160" w:before="240" w:line="360"/>
+        <w:ind w:left="700" w:hanging="400"/>
+      </w:pPr>
+      <w:r>
+        <w:rPr>
+          <w:b/>
+          <w:bCs/>
+          <w:i/>
+          <w:iCs/>
+        </w:rPr>
+        <w:t xml:space="preserve">e.	</w:t>
+      </w:r>
+      <w:r>
+        <w:rPr>
+          <w:b/>
+          <w:bCs/>
+          <w:i/>
+          <w:iCs/>
+        </w:rPr>
         <w:t xml:space="preserve">Dos danos morais:</w:t>
       </w:r>
     </w:p>
@@ -702,7 +880,7 @@
         <w:jc w:val="both"/>
       </w:pPr>
       <w:r>
-        <w:t xml:space="preserve">A retenção indevida dos saldos ultrapassa o mero aborrecimento cotidiano. O primeiro autor, comerciante, foi privado de recursos próprios por quase dois anos, sem informação clara sobre seu destino, e foi obrigado a percorrer o atendimento telefônico da ré, aguardar respostas que nunca vieram e recorrer ao PROCON, sem êxito. A situação caracteriza o </w:t>
+        <w:t xml:space="preserve">A conduta da ré ultrapassa o mero inadimplemento contratual. O primeiro autor, pequeno comerciante, está privado de recursos próprios há quase dois anos, sem informação clara sobre a causa da restrição ou sobre o destino dos valores, e foi obrigado a percorrer o atendimento telefônico da ré, aguardar respostas que nunca vieram e recorrer ao PROCON, sem êxito. Como assentou a 1ª Turma Recursal do TJPI no precedente acima transcrito, a privação injustificada do acesso a recursos financeiros do consumidor ultrapassa o mero dissabor cotidiano. A situação caracteriza, ainda, o </w:t>
       </w:r>
       <w:r>
         <w:rPr>
@@ -714,7 +892,7 @@
         <w:t xml:space="preserve">desvio produtivo do consumidor</w:t>
       </w:r>
       <w:r>
-        <w:t xml:space="preserve">: a perda de tempo útil para resolver problema criado exclusivamente pelo fornecedor.</w:t>
+        <w:t xml:space="preserve">, isto é, a perda de tempo útil para resolver problema criado exclusivamente pelo fornecedor, e é agravada pela manutenção do bloqueio mesmo após a provocação do órgão de defesa do consumidor.</w:t>
       </w:r>
     </w:p>
     <w:p>
@@ -736,17 +914,17 @@
         <w:t xml:space="preserve">Súmula 227 do STJ</w:t>
       </w:r>
       <w:r>
-        <w:t xml:space="preserve">). O bloqueio súbito da conta empresarial, por meio da qual eram movimentadas as receitas do estabelecimento, comprometeu a organização financeira do negócio e afetou sua credibilidade perante clientes e fornecedores, configurando ofensa à sua honra objetiva.</w:t>
-      </w:r>
-    </w:p>
-    <w:p>
-      <w:pPr>
-        <w:spacing w:after="60" w:line="360"/>
-        <w:ind w:firstLine="850"/>
-        <w:jc w:val="both"/>
-      </w:pPr>
-      <w:r>
-        <w:t xml:space="preserve">Considerando a conduta da ré, a duração da retenção, a recusa injustificada em resolver o problema na via administrativa, a capacidade econômica das partes e o caráter pedagógico da condenação, mostra-se razoável a fixação da indenização em </w:t>
+        <w:t xml:space="preserve">). O bloqueio súbito da conta empresarial, por meio da qual eram movimentadas as receitas do estabelecimento, sob a imputação genérica de “indício de ilicitude”, comprometeu a organização financeira do negócio e atingiu sua honra objetiva.</w:t>
+      </w:r>
+    </w:p>
+    <w:p>
+      <w:pPr>
+        <w:spacing w:after="60" w:line="360"/>
+        <w:ind w:firstLine="850"/>
+        <w:jc w:val="both"/>
+      </w:pPr>
+      <w:r>
+        <w:t xml:space="preserve">Considerando a duração da retenção, a recusa injustificada em resolver o problema na via administrativa, a capacidade econômica das partes e o caráter pedagógico da condenação, mostra-se razoável a fixação da indenização em </w:t>
       </w:r>
       <w:r>
         <w:rPr>
@@ -758,7 +936,7 @@
         <w:t xml:space="preserve">R$ 5.000,00 (cinco mil reais) para cada autor</w:t>
       </w:r>
       <w:r>
-        <w:t xml:space="preserve">.</w:t>
+        <w:t xml:space="preserve">, totalizando R$ 10.000,00 (dez mil reais).</w:t>
       </w:r>
     </w:p>
     <w:p>
@@ -788,27 +966,27 @@
         <w:jc w:val="both"/>
       </w:pPr>
       <w:r>
-        <w:t xml:space="preserve">Estão presentes os requisitos do art. 300 do CPC. A probabilidade do direito decorre da própria natureza dos valores, que pertencem aos autores e constituem patrimônio separado do da ré (art. 12 da Lei nº 12.865/2013), da inexistência de qualquer débito e da ausência de justificativa concreta para a retenção, conforme se extrai da resposta apresentada ao PROCON.</w:t>
-      </w:r>
-    </w:p>
-    <w:p>
-      <w:pPr>
-        <w:spacing w:after="60" w:line="360"/>
-        <w:ind w:firstLine="850"/>
-        <w:jc w:val="both"/>
-      </w:pPr>
-      <w:r>
-        <w:t xml:space="preserve">O perigo de dano está na privação continuada de recursos de pequeno comerciante, que já perdura por quase dois anos, e no risco de que os registros das contas encerradas deixem de ser preservados, comprometendo a apuração do valor devido. A medida, ademais, é plenamente reversível (art. 300, § 3º, do CPC).</w:t>
-      </w:r>
-    </w:p>
-    <w:p>
-      <w:pPr>
-        <w:spacing w:after="60" w:line="360"/>
-        <w:ind w:firstLine="850"/>
-        <w:jc w:val="both"/>
-      </w:pPr>
-      <w:r>
-        <w:t xml:space="preserve">Requer-se, assim, a concessão de tutela de urgência para determinar que a ré, no prazo de 5 (cinco) dias: (i) apresente nos autos os extratos completos das duas contas e informe o saldo existente em cada uma na data do encerramento; e (ii) deposite judicialmente os valores apurados ou os transfira para conta indicada pelos autores, sob pena de multa diária a ser fixada por Vossa Excelência.</w:t>
+        <w:t xml:space="preserve">Estão presentes os requisitos do art. 300 do CPC. A probabilidade do direito decorre da titularidade dos valores, que constituem patrimônio separado do da ré (art. 12 da Lei nº 12.865/2013), da inexistência de qualquer débito dos autores e da própria resposta da ré ao PROCON, que não aponta conduta concreta e admite não haver previsão de desbloqueio.</w:t>
+      </w:r>
+    </w:p>
+    <w:p>
+      <w:pPr>
+        <w:spacing w:after="60" w:line="360"/>
+        <w:ind w:firstLine="850"/>
+        <w:jc w:val="both"/>
+      </w:pPr>
+      <w:r>
+        <w:t xml:space="preserve">O perigo de dano está na privação continuada de recursos de pequeno comerciante, que já perdura por quase dois anos, e no risco de que os registros das contas encerradas deixem de ser preservados, comprometendo a apuração do valor devido. A medida é plenamente reversível (art. 300, § 3º, do CPC).</w:t>
+      </w:r>
+    </w:p>
+    <w:p>
+      <w:pPr>
+        <w:spacing w:after="60" w:line="360"/>
+        <w:ind w:firstLine="850"/>
+        <w:jc w:val="both"/>
+      </w:pPr>
+      <w:r>
+        <w:t xml:space="preserve">Requer-se, assim, a concessão de tutela de urgência para determinar que a ré, no prazo de 5 (cinco) dias: (i) apresente nos autos os extratos completos das duas contas e informe o saldo existente em cada uma em 04/11/2024; e (ii) deposite judicialmente os valores apurados ou os transfira para conta indicada pelos autores, sob pena de multa diária a ser fixada por Vossa Excelência (art. 84, § 4º, do CDC e art. 537 do CPC).</w:t>
       </w:r>
     </w:p>
     <w:p>
@@ -886,7 +1064,7 @@
         <w:t xml:space="preserve">C.	</w:t>
       </w:r>
       <w:r>
-        <w:t xml:space="preserve">a aplicação do Código de Defesa do Consumidor e a inversão do ônus da prova (art. 6º, VIII, do CDC);</w:t>
+        <w:t xml:space="preserve">o reconhecimento da relação de consumo, inclusive quanto à segunda autora, e a inversão do ônus da prova (art. 6º, VIII, do CDC);</w:t>
       </w:r>
     </w:p>
     <w:p>
@@ -902,7 +1080,7 @@
         <w:t xml:space="preserve">D.	</w:t>
       </w:r>
       <w:r>
-        <w:t xml:space="preserve">a intimação da ré para exibir os extratos completos das duas contas, desde a abertura até o encerramento, e os documentos relativos ao encerramento, sob as penas do art. 400 do CPC;</w:t>
+        <w:t xml:space="preserve">a intimação da ré para exibir os extratos completos das duas contas, desde a abertura até o encerramento, e os documentos relativos ao bloqueio e ao encerramento, sob as penas do art. 400 do CPC;</w:t>
       </w:r>
     </w:p>
     <w:p>
@@ -1072,7 +1250,7 @@
           <w:szCs w:val="22"/>
           <w:shd w:fill="FFF200" w:color="auto" w:val="clear"/>
         </w:rPr>
-        <w:t xml:space="preserve">[Doc. 05 – Comprovantes de titularidade das contas no PagBank (prints, cartões, comprovantes de transações);]</w:t>
+        <w:t xml:space="preserve">[Doc. 05 – Comprovantes de titularidade das contas no PagBank (prints, comprovantes de transações);]</w:t>
       </w:r>
     </w:p>
     <w:p>
@@ -1120,7 +1298,39 @@
           <w:szCs w:val="22"/>
           <w:shd w:fill="FFF200" w:color="auto" w:val="clear"/>
         </w:rPr>
-        <w:t xml:space="preserve">[Doc. 08 – Reclamação no PROCON itinerante de Miguel Alves-PI e resposta da ré.]</w:t>
+        <w:t xml:space="preserve">[Doc. 08 – Reclamação no PROCON (protocolo nº 2503002600200036301) e resposta da ré de 20/03/2025;]</w:t>
+      </w:r>
+    </w:p>
+    <w:p>
+      <w:pPr>
+        <w:spacing w:after="0" w:line="300"/>
+        <w:ind w:left="850"/>
+      </w:pPr>
+      <w:r>
+        <w:rPr>
+          <w:b/>
+          <w:bCs/>
+          <w:sz w:val="22"/>
+          <w:szCs w:val="22"/>
+          <w:shd w:fill="FFF200" w:color="auto" w:val="clear"/>
+        </w:rPr>
+        <w:t xml:space="preserve">[Doc. 09 – Termos de uso do PagBank (cláusulas 5.10, 5.15.3 e 14.4);]</w:t>
+      </w:r>
+    </w:p>
+    <w:p>
+      <w:pPr>
+        <w:spacing w:after="0" w:line="300"/>
+        <w:ind w:left="850"/>
+      </w:pPr>
+      <w:r>
+        <w:rPr>
+          <w:b/>
+          <w:bCs/>
+          <w:sz w:val="22"/>
+          <w:szCs w:val="22"/>
+          <w:shd w:fill="FFF200" w:color="auto" w:val="clear"/>
+        </w:rPr>
+        <w:t xml:space="preserve">[Doc. 10 – Inteiro teor do AgInt no AREsp nº 2.607.102/GO e do RI nº 0800939-21.2025.8.18.0057 (TJPI).]</w:t>
       </w:r>
     </w:p>
     <w:p>

</xml_diff>

<commit_message>
Inicial PagBank: antecipa a tese do STJ sobre encerramento unilateral (notificação prévia e devolução do saldo)
Co-Authored-By: Claude Opus 5.5 <noreply@anthropic.com>
Claude-Session: https://claude.ai/code/session_01SFjamS7EZogQCva5nedbPz
</commit_message>
<xml_diff>
--- a/Inicial - Pedro Acelino e Moura x PagBank/Petição inicial - Pedro Acelino e Moura x PagBank.docx
+++ b/Inicial - Pedro Acelino e Moura x PagBank/Petição inicial - Pedro Acelino e Moura x PagBank.docx
@@ -764,6 +764,82 @@
         <w:jc w:val="both"/>
       </w:pPr>
       <w:r>
+        <w:t xml:space="preserve">A própria jurisprudência do Superior Tribunal de Justiça que admite o encerramento unilateral da conta o condiciona à </w:t>
+      </w:r>
+      <w:r>
+        <w:rPr>
+          <w:b/>
+          <w:bCs/>
+          <w:u w:val="single"/>
+          <w:shd w:fill="CFE2F3" w:color="auto" w:val="clear"/>
+        </w:rPr>
+        <w:t xml:space="preserve">comunicação prévia ao titular</w:t>
+      </w:r>
+      <w:r>
+        <w:t xml:space="preserve">, e só afasta o ilícito e o dano moral quando, além dela, há a </w:t>
+      </w:r>
+      <w:r>
+        <w:rPr>
+          <w:b/>
+          <w:bCs/>
+          <w:u w:val="single"/>
+          <w:shd w:fill="CFE2F3" w:color="auto" w:val="clear"/>
+        </w:rPr>
+        <w:t xml:space="preserve">devolução do saldo</w:t>
+      </w:r>
+      <w:r>
+        <w:t xml:space="preserve">:</w:t>
+      </w:r>
+    </w:p>
+    <w:p>
+      <w:pPr>
+        <w:pBdr>
+          <w:top w:val="single" w:color="9AA0A6" w:sz="4" w:space="6"/>
+          <w:bottom w:val="single" w:color="9AA0A6" w:sz="4" w:space="6"/>
+        </w:pBdr>
+        <w:spacing w:after="200" w:before="160" w:line="240"/>
+        <w:ind w:left="2270" w:right="570"/>
+        <w:jc w:val="both"/>
+      </w:pPr>
+      <w:r>
+        <w:rPr>
+          <w:i/>
+          <w:iCs/>
+          <w:sz w:val="18"/>
+          <w:szCs w:val="18"/>
+        </w:rPr>
+        <w:t xml:space="preserve">AGRAVO EM RECURSO ESPECIAL. PROCESSUAL CIVIL. CONTRATO BANCÁRIO. ENCERRAMENTO UNILATERAL DE CONTA CORRENTE. [...] 1. A jurisprudência desta Corte Superior consolidou-se no sentido de que é legítimo o encerramento unilateral de conta corrente por desinteresse comercial, desde que haja comunicação prévia. 2. O Tribunal de origem, amparado no acervo fático-probatório, concluiu pela licitude do encerramento da conta e pela inexistência de dano moral ante a comprovação de notificação prévia e devolução do saldo. [...] (STJ - AREsp nº 2.956.052/SP, Rel. Min. Ricardo Villas Bôas Cueva, Terceira Turma, julgado em 30/03/2026, DJEN 07/04/2026)</w:t>
+      </w:r>
+    </w:p>
+    <w:p>
+      <w:pPr>
+        <w:spacing w:after="60" w:line="360"/>
+        <w:ind w:firstLine="850"/>
+        <w:jc w:val="both"/>
+      </w:pPr>
+      <w:r>
+        <w:t xml:space="preserve">No mesmo sentido, o AgInt no AREsp nº 1.478.859/SP (Rel. Min. Marco Aurélio Bellizze, Terceira Turma, DJe 03/03/2021) qualifica o encerramento como direito subjetivo das partes “desde que observada a prévia e regular notificação”. No caso dos autos, </w:t>
+      </w:r>
+      <w:r>
+        <w:rPr>
+          <w:b/>
+          <w:bCs/>
+          <w:u w:val="single"/>
+          <w:shd w:fill="CFE2F3" w:color="auto" w:val="clear"/>
+        </w:rPr>
+        <w:t xml:space="preserve">nenhuma das duas condições foi atendida</w:t>
+      </w:r>
+      <w:r>
+        <w:t xml:space="preserve">: as contas foram encerradas sem comunicação prévia e o saldo jamais foi devolvido. O precedente que a ré certamente invocará, portanto, confirma a ilicitude de sua conduta.</w:t>
+      </w:r>
+    </w:p>
+    <w:p>
+      <w:pPr>
+        <w:spacing w:after="60" w:line="360"/>
+        <w:ind w:firstLine="850"/>
+        <w:jc w:val="both"/>
+      </w:pPr>
+      <w:r>
         <w:t xml:space="preserve">O abuso decorre do conjunto das circunstâncias: (i) ausência de indicação do motivo concreto da restrição; (ii) encerramento sem comunicação prévia; (iii) manutenção do bloqueio por quase dois anos, sem prazo definido; e (iv) confissão da própria ré, perante o PROCON, de que “não é possível desbloquear os valores”, sem apresentar alternativa para restituí-los. A menção genérica a “medidas de segurança” e “indício de ilicitude” não supre o dever de informação clara e adequada (art. 6º, III, do CDC).</w:t>
       </w:r>
     </w:p>
@@ -1330,7 +1406,7 @@
           <w:szCs w:val="22"/>
           <w:shd w:fill="FFF200" w:color="auto" w:val="clear"/>
         </w:rPr>
-        <w:t xml:space="preserve">[Doc. 10 – Inteiro teor do AgInt no AREsp nº 2.607.102/GO e do RI nº 0800939-21.2025.8.18.0057 (TJPI).]</w:t>
+        <w:t xml:space="preserve">[Doc. 10 – Inteiro teor do AgInt no AREsp nº 2.607.102/GO, do AREsp nº 2.956.052/SP, do AgInt no AREsp nº 1.478.859/SP e do RI nº 0800939-21.2025.8.18.0057 (TJPI).]</w:t>
       </w:r>
     </w:p>
     <w:p>

</xml_diff>

<commit_message>
Inicial PagBank: acrescenta precedente da 3ª Turma Recursal do TJPI sobre retenção de saldo de conta digital
Co-Authored-By: Claude Opus 5.5 <noreply@anthropic.com>
Claude-Session: https://claude.ai/code/session_01SFjamS7EZogQCva5nedbPz
</commit_message>
<xml_diff>
--- a/Inicial - Pedro Acelino e Moura x PagBank/Petição inicial - Pedro Acelino e Moura x PagBank.docx
+++ b/Inicial - Pedro Acelino e Moura x PagBank/Petição inicial - Pedro Acelino e Moura x PagBank.docx
@@ -670,125 +670,7 @@
         <w:jc w:val="both"/>
       </w:pPr>
       <w:r>
-        <w:t xml:space="preserve">A ré, portanto, não tem título para reter os valores. Não há débito dos autores, ordem judicial de bloqueio, nem procedimento comunicado aos titulares com indicação da conduta imputada. A retenção por prazo indefinido configura vantagem manifestamente excessiva e prática abusiva (arts. 39, V, e 51, IV, do CDC), além de </w:t>
-      </w:r>
-      <w:r>
-        <w:rPr>
-          <w:b/>
-          <w:bCs/>
-          <w:u w:val="single"/>
-          <w:shd w:fill="CFE2F3" w:color="auto" w:val="clear"/>
-        </w:rPr>
-        <w:t xml:space="preserve">enriquecimento sem causa</w:t>
-      </w:r>
-      <w:r>
-        <w:t xml:space="preserve"> (art. 884 do Código Civil).</w:t>
-      </w:r>
-    </w:p>
-    <w:p>
-      <w:pPr>
-        <w:spacing w:after="60" w:line="360"/>
-        <w:ind w:firstLine="850"/>
-        <w:jc w:val="both"/>
-      </w:pPr>
-      <w:r>
-        <w:t xml:space="preserve">O Superior Tribunal de Justiça já analisou controvérsia envolvendo a própria ré. No </w:t>
-      </w:r>
-      <w:r>
-        <w:rPr>
-          <w:b/>
-          <w:bCs/>
-          <w:u w:val="single"/>
-          <w:shd w:fill="CFE2F3" w:color="auto" w:val="clear"/>
-        </w:rPr>
-        <w:t xml:space="preserve">AgInt no AREsp nº 2.607.102/GO</w:t>
-      </w:r>
-      <w:r>
-        <w:t xml:space="preserve"> (Rel. Min. Humberto Martins, Terceira Turma, julgado em 22/04/2026, DJe 27/04/2026), a Corte manteve acórdão que, embora reconhecesse a validade genérica de cláusulas de bloqueio para apuração de irregularidades, considerou abusiva a retenção por período superior a 90 dias, ante a ausência de comprovação dos estornos que justificariam a medida, determinando a restituição dos valores. No caso dos autos, a situação é mais grave: os valores estão indisponíveis há quase dois anos, sem justificativa concreta, comprovação de fraude, indicação de estorno ou prazo para liberação.</w:t>
-      </w:r>
-    </w:p>
-    <w:p>
-      <w:pPr>
-        <w:keepNext/>
-        <w:tabs>
-          <w:tab w:val="left" w:pos="700"/>
-        </w:tabs>
-        <w:spacing w:after="160" w:before="240" w:line="360"/>
-        <w:ind w:left="700" w:hanging="400"/>
-      </w:pPr>
-      <w:r>
-        <w:rPr>
-          <w:b/>
-          <w:bCs/>
-          <w:i/>
-          <w:iCs/>
-        </w:rPr>
-        <w:t xml:space="preserve">c.	</w:t>
-      </w:r>
-      <w:r>
-        <w:rPr>
-          <w:b/>
-          <w:bCs/>
-          <w:i/>
-          <w:iCs/>
-        </w:rPr>
-        <w:t xml:space="preserve">Do abuso de direito e da interpretação das cláusulas contratuais:</w:t>
-      </w:r>
-    </w:p>
-    <w:p>
-      <w:pPr>
-        <w:spacing w:after="60" w:line="360"/>
-        <w:ind w:firstLine="850"/>
-        <w:jc w:val="both"/>
-      </w:pPr>
-      <w:r>
-        <w:t xml:space="preserve">Não se nega que a ré possa, nos termos do contrato, adotar medidas de segurança ou encerrar a relação contratual em determinadas hipóteses. O exercício dessa prerrogativa, porém, não é absoluto e </w:t>
-      </w:r>
-      <w:r>
-        <w:rPr>
-          <w:b/>
-          <w:bCs/>
-          <w:u w:val="single"/>
-          <w:shd w:fill="CFE2F3" w:color="auto" w:val="clear"/>
-        </w:rPr>
-        <w:t xml:space="preserve">não autoriza a apropriação dos recursos do cliente</w:t>
-      </w:r>
-      <w:r>
-        <w:t xml:space="preserve">. Comete ato ilícito quem exerce um direito excedendo manifestamente os limites impostos pelo seu fim econômico ou social e pela boa-fé (art. 187 do Código Civil).</w:t>
-      </w:r>
-    </w:p>
-    <w:p>
-      <w:pPr>
-        <w:spacing w:after="60" w:line="360"/>
-        <w:ind w:firstLine="850"/>
-        <w:jc w:val="both"/>
-      </w:pPr>
-      <w:r>
-        <w:t xml:space="preserve">A própria jurisprudência do Superior Tribunal de Justiça que admite o encerramento unilateral da conta o condiciona à </w:t>
-      </w:r>
-      <w:r>
-        <w:rPr>
-          <w:b/>
-          <w:bCs/>
-          <w:u w:val="single"/>
-          <w:shd w:fill="CFE2F3" w:color="auto" w:val="clear"/>
-        </w:rPr>
-        <w:t xml:space="preserve">comunicação prévia ao titular</w:t>
-      </w:r>
-      <w:r>
-        <w:t xml:space="preserve">, e só afasta o ilícito e o dano moral quando, além dela, há a </w:t>
-      </w:r>
-      <w:r>
-        <w:rPr>
-          <w:b/>
-          <w:bCs/>
-          <w:u w:val="single"/>
-          <w:shd w:fill="CFE2F3" w:color="auto" w:val="clear"/>
-        </w:rPr>
-        <w:t xml:space="preserve">devolução do saldo</w:t>
-      </w:r>
-      <w:r>
-        <w:t xml:space="preserve">:</w:t>
+        <w:t xml:space="preserve">O entendimento não é isolado: a 3ª Turma Recursal do TJPI, ao examinar a retenção de saldo de conta digital, também reconheceu a falha na prestação do serviço, o dever de ressarcir o cliente e os danos morais:</w:t>
       </w:r>
     </w:p>
     <w:p>
@@ -808,59 +690,51 @@
           <w:sz w:val="18"/>
           <w:szCs w:val="18"/>
         </w:rPr>
-        <w:t xml:space="preserve">AGRAVO EM RECURSO ESPECIAL. PROCESSUAL CIVIL. CONTRATO BANCÁRIO. ENCERRAMENTO UNILATERAL DE CONTA CORRENTE. [...] 1. A jurisprudência desta Corte Superior consolidou-se no sentido de que é legítimo o encerramento unilateral de conta corrente por desinteresse comercial, desde que haja comunicação prévia. 2. O Tribunal de origem, amparado no acervo fático-probatório, concluiu pela licitude do encerramento da conta e pela inexistência de dano moral ante a comprovação de notificação prévia e devolução do saldo. [...] (STJ - AREsp nº 2.956.052/SP, Rel. Min. Ricardo Villas Bôas Cueva, Terceira Turma, julgado em 30/03/2026, DJEN 07/04/2026)</w:t>
-      </w:r>
-    </w:p>
-    <w:p>
-      <w:pPr>
-        <w:spacing w:after="60" w:line="360"/>
-        <w:ind w:firstLine="850"/>
-        <w:jc w:val="both"/>
-      </w:pPr>
-      <w:r>
-        <w:t xml:space="preserve">No mesmo sentido, o AgInt no AREsp nº 1.478.859/SP (Rel. Min. Marco Aurélio Bellizze, Terceira Turma, DJe 03/03/2021) qualifica o encerramento como direito subjetivo das partes “desde que observada a prévia e regular notificação”. No caso dos autos, </w:t>
-      </w:r>
-      <w:r>
-        <w:rPr>
-          <w:b/>
-          <w:bCs/>
-          <w:u w:val="single"/>
-          <w:shd w:fill="CFE2F3" w:color="auto" w:val="clear"/>
-        </w:rPr>
-        <w:t xml:space="preserve">nenhuma das duas condições foi atendida</w:t>
-      </w:r>
-      <w:r>
-        <w:t xml:space="preserve">: as contas foram encerradas sem comunicação prévia e o saldo jamais foi devolvido. O precedente que a ré certamente invocará, portanto, confirma a ilicitude de sua conduta.</w:t>
-      </w:r>
-    </w:p>
-    <w:p>
-      <w:pPr>
-        <w:spacing w:after="60" w:line="360"/>
-        <w:ind w:firstLine="850"/>
-        <w:jc w:val="both"/>
-      </w:pPr>
-      <w:r>
-        <w:t xml:space="preserve">O abuso decorre do conjunto das circunstâncias: (i) ausência de indicação do motivo concreto da restrição; (ii) encerramento sem comunicação prévia; (iii) manutenção do bloqueio por quase dois anos, sem prazo definido; e (iv) confissão da própria ré, perante o PROCON, de que “não é possível desbloquear os valores”, sem apresentar alternativa para restituí-los. A menção genérica a “medidas de segurança” e “indício de ilicitude” não supre o dever de informação clara e adequada (art. 6º, III, do CDC).</w:t>
-      </w:r>
-    </w:p>
-    <w:p>
-      <w:pPr>
-        <w:spacing w:after="60" w:line="360"/>
-        <w:ind w:firstLine="850"/>
-        <w:jc w:val="both"/>
-      </w:pPr>
-      <w:r>
-        <w:t xml:space="preserve">As cláusulas 5.10, 5.15.3 e 14.4, invocadas pela ré, não podem ser interpretadas de forma absoluta. Sua aplicação deve observar a boa-fé objetiva e a função social do contrato (arts. 421 e 422 do Código Civil) e, nos termos do art. 47 do CDC, ser interpretada da maneira mais favorável ao consumidor, não se prestando a legitimar a retenção indefinida de valores de titularidade dos autores.</w:t>
-      </w:r>
-    </w:p>
-    <w:p>
-      <w:pPr>
-        <w:spacing w:after="60" w:line="360"/>
-        <w:ind w:firstLine="850"/>
-        <w:jc w:val="both"/>
-      </w:pPr>
-      <w:r>
-        <w:t xml:space="preserve">Mesmo que afastada a incidência do diploma consumerista em relação à segunda autora, a conclusão seria a mesma, pois a retenção de valores alheios sem causa jurídica configura ato ilícito e enriquecimento sem causa (arts. 186, 187, 884 e 927 do Código Civil).</w:t>
+        <w:t xml:space="preserve">RECURSO INOMINADO. AÇÃO DECLARATÓRIA DE NULIDADE DE ACORDO C/C REPETIÇÃO DO INDÉBITO E INDENIZAÇÃO POR DANOS MORAIS. PRELIMINAR DE NULIDADE DE CITAÇÃO REJEITADA. APLICABILIDADE DO CDC. INVERSÃO DO ÔNUS DA PROVA. RESPONSABILIDADE CIVIL OBJETIVA DO RÉU. RETENÇÃO DE SALDO DE CONTA DIGITAL. BLOQUEIO INDEVIDO. PLEITO AUTORAL PROCEDENTE. FALHA NA PRESTAÇÃO DO SERVIÇO. DEVER DO BANCO DE RESSARCIR O CLIENTE. DANOS MORAIS CONFIGURADOS. QUANTUM INDENIZATÓRIO PROPORCIONAL E RAZOÁVEL. SENTENÇA MANTIDA. RECURSO CONHECIDO E IMPROVIDO. (TJ-PI - Recurso Inominado Cível nº 0803814-42.2022.8.18.0162, Rel. Francisco João Damasceno, 3ª Turma Recursal, publicado em 22/11/2023)</w:t>
+      </w:r>
+    </w:p>
+    <w:p>
+      <w:pPr>
+        <w:spacing w:after="60" w:line="360"/>
+        <w:ind w:firstLine="850"/>
+        <w:jc w:val="both"/>
+      </w:pPr>
+      <w:r>
+        <w:t xml:space="preserve">A ré, portanto, não tem título para reter os valores. Não há débito dos autores, ordem judicial de bloqueio, nem procedimento comunicado aos titulares com indicação da conduta imputada. A retenção por prazo indefinido configura vantagem manifestamente excessiva e prática abusiva (arts. 39, V, e 51, IV, do CDC), além de </w:t>
+      </w:r>
+      <w:r>
+        <w:rPr>
+          <w:b/>
+          <w:bCs/>
+          <w:u w:val="single"/>
+          <w:shd w:fill="CFE2F3" w:color="auto" w:val="clear"/>
+        </w:rPr>
+        <w:t xml:space="preserve">enriquecimento sem causa</w:t>
+      </w:r>
+      <w:r>
+        <w:t xml:space="preserve"> (art. 884 do Código Civil).</w:t>
+      </w:r>
+    </w:p>
+    <w:p>
+      <w:pPr>
+        <w:spacing w:after="60" w:line="360"/>
+        <w:ind w:firstLine="850"/>
+        <w:jc w:val="both"/>
+      </w:pPr>
+      <w:r>
+        <w:t xml:space="preserve">O Superior Tribunal de Justiça já analisou controvérsia envolvendo a própria ré. No </w:t>
+      </w:r>
+      <w:r>
+        <w:rPr>
+          <w:b/>
+          <w:bCs/>
+          <w:u w:val="single"/>
+          <w:shd w:fill="CFE2F3" w:color="auto" w:val="clear"/>
+        </w:rPr>
+        <w:t xml:space="preserve">AgInt no AREsp nº 2.607.102/GO</w:t>
+      </w:r>
+      <w:r>
+        <w:t xml:space="preserve"> (Rel. Min. Humberto Martins, Terceira Turma, julgado em 22/04/2026, DJe 27/04/2026), a Corte manteve acórdão que, embora reconhecesse a validade genérica de cláusulas de bloqueio para apuração de irregularidades, considerou abusiva a retenção por período superior a 90 dias, ante a ausência de comprovação dos estornos que justificariam a medida, determinando a restituição dos valores. No caso dos autos, a situação é mais grave: os valores estão indisponíveis há quase dois anos, sem justificativa concreta, comprovação de fraude, indicação de estorno ou prazo para liberação.</w:t>
       </w:r>
     </w:p>
     <w:p>
@@ -879,46 +753,144 @@
           <w:i/>
           <w:iCs/>
         </w:rPr>
-        <w:t xml:space="preserve">d.	</w:t>
-      </w:r>
-      <w:r>
-        <w:rPr>
-          <w:b/>
-          <w:bCs/>
-          <w:i/>
-          <w:iCs/>
-        </w:rPr>
-        <w:t xml:space="preserve">Da restituição dos saldos e da exibição dos extratos:</w:t>
-      </w:r>
-    </w:p>
-    <w:p>
-      <w:pPr>
-        <w:spacing w:after="60" w:line="360"/>
-        <w:ind w:firstLine="850"/>
-        <w:jc w:val="both"/>
-      </w:pPr>
-      <w:r>
-        <w:t xml:space="preserve">Os autores têm direito à restituição integral dos saldos existentes em ambas as contas na data do encerramento, com correção monetária desde 04/11/2024 e juros de mora desde a citação (arts. 389, 405 e 406 do Código Civil, na redação da Lei nº 14.905/2024).</w:t>
-      </w:r>
-    </w:p>
-    <w:p>
-      <w:pPr>
-        <w:spacing w:after="60" w:line="360"/>
-        <w:ind w:firstLine="850"/>
-        <w:jc w:val="both"/>
-      </w:pPr>
-      <w:r>
-        <w:t xml:space="preserve">Como o valor exato depende de documentos que estão exclusivamente em poder da ré, o pedido é formulado de forma genérica quanto ao montante, o que é admitido quando não for possível determinar, desde logo, a extensão da obrigação (art. 14, § 2º, da Lei nº 9.099/1995 e art. 324, § 1º, III, do CPC), indicando-se como estimativa o valor de R$ 3.500,00.</w:t>
-      </w:r>
-    </w:p>
-    <w:p>
-      <w:pPr>
-        <w:spacing w:after="60" w:line="360"/>
-        <w:ind w:firstLine="850"/>
-        <w:jc w:val="both"/>
-      </w:pPr>
-      <w:r>
-        <w:t xml:space="preserve">Requer-se, ainda, que a ré seja compelida a exibir os extratos completos das duas contas, desde a abertura até o encerramento, bem como os documentos relativos ao bloqueio e ao encerramento (arts. 396 e 399, I e III, do CPC). Em caso de recusa ou omissão, deverão ser admitidos como verdadeiros os fatos que os autores pretendem provar, prevalecendo o valor estimado nesta inicial (art. 400 do CPC).</w:t>
+        <w:t xml:space="preserve">c.	</w:t>
+      </w:r>
+      <w:r>
+        <w:rPr>
+          <w:b/>
+          <w:bCs/>
+          <w:i/>
+          <w:iCs/>
+        </w:rPr>
+        <w:t xml:space="preserve">Do abuso de direito e da interpretação das cláusulas contratuais:</w:t>
+      </w:r>
+    </w:p>
+    <w:p>
+      <w:pPr>
+        <w:spacing w:after="60" w:line="360"/>
+        <w:ind w:firstLine="850"/>
+        <w:jc w:val="both"/>
+      </w:pPr>
+      <w:r>
+        <w:t xml:space="preserve">Não se nega que a ré possa, nos termos do contrato, adotar medidas de segurança ou encerrar a relação contratual em determinadas hipóteses. O exercício dessa prerrogativa, porém, não é absoluto e </w:t>
+      </w:r>
+      <w:r>
+        <w:rPr>
+          <w:b/>
+          <w:bCs/>
+          <w:u w:val="single"/>
+          <w:shd w:fill="CFE2F3" w:color="auto" w:val="clear"/>
+        </w:rPr>
+        <w:t xml:space="preserve">não autoriza a apropriação dos recursos do cliente</w:t>
+      </w:r>
+      <w:r>
+        <w:t xml:space="preserve">. Comete ato ilícito quem exerce um direito excedendo manifestamente os limites impostos pelo seu fim econômico ou social e pela boa-fé (art. 187 do Código Civil).</w:t>
+      </w:r>
+    </w:p>
+    <w:p>
+      <w:pPr>
+        <w:spacing w:after="60" w:line="360"/>
+        <w:ind w:firstLine="850"/>
+        <w:jc w:val="both"/>
+      </w:pPr>
+      <w:r>
+        <w:t xml:space="preserve">A própria jurisprudência do Superior Tribunal de Justiça que admite o encerramento unilateral da conta o condiciona à </w:t>
+      </w:r>
+      <w:r>
+        <w:rPr>
+          <w:b/>
+          <w:bCs/>
+          <w:u w:val="single"/>
+          <w:shd w:fill="CFE2F3" w:color="auto" w:val="clear"/>
+        </w:rPr>
+        <w:t xml:space="preserve">comunicação prévia ao titular</w:t>
+      </w:r>
+      <w:r>
+        <w:t xml:space="preserve">, e só afasta o ilícito e o dano moral quando, além dela, há a </w:t>
+      </w:r>
+      <w:r>
+        <w:rPr>
+          <w:b/>
+          <w:bCs/>
+          <w:u w:val="single"/>
+          <w:shd w:fill="CFE2F3" w:color="auto" w:val="clear"/>
+        </w:rPr>
+        <w:t xml:space="preserve">devolução do saldo</w:t>
+      </w:r>
+      <w:r>
+        <w:t xml:space="preserve">:</w:t>
+      </w:r>
+    </w:p>
+    <w:p>
+      <w:pPr>
+        <w:pBdr>
+          <w:top w:val="single" w:color="9AA0A6" w:sz="4" w:space="6"/>
+          <w:bottom w:val="single" w:color="9AA0A6" w:sz="4" w:space="6"/>
+        </w:pBdr>
+        <w:spacing w:after="200" w:before="160" w:line="240"/>
+        <w:ind w:left="2270" w:right="570"/>
+        <w:jc w:val="both"/>
+      </w:pPr>
+      <w:r>
+        <w:rPr>
+          <w:i/>
+          <w:iCs/>
+          <w:sz w:val="18"/>
+          <w:szCs w:val="18"/>
+        </w:rPr>
+        <w:t xml:space="preserve">AGRAVO EM RECURSO ESPECIAL. PROCESSUAL CIVIL. CONTRATO BANCÁRIO. ENCERRAMENTO UNILATERAL DE CONTA CORRENTE. [...] 1. A jurisprudência desta Corte Superior consolidou-se no sentido de que é legítimo o encerramento unilateral de conta corrente por desinteresse comercial, desde que haja comunicação prévia. 2. O Tribunal de origem, amparado no acervo fático-probatório, concluiu pela licitude do encerramento da conta e pela inexistência de dano moral ante a comprovação de notificação prévia e devolução do saldo. [...] (STJ - AREsp nº 2.956.052/SP, Rel. Min. Ricardo Villas Bôas Cueva, Terceira Turma, julgado em 30/03/2026, DJEN 07/04/2026)</w:t>
+      </w:r>
+    </w:p>
+    <w:p>
+      <w:pPr>
+        <w:spacing w:after="60" w:line="360"/>
+        <w:ind w:firstLine="850"/>
+        <w:jc w:val="both"/>
+      </w:pPr>
+      <w:r>
+        <w:t xml:space="preserve">No mesmo sentido, o AgInt no AREsp nº 1.478.859/SP (Rel. Min. Marco Aurélio Bellizze, Terceira Turma, DJe 03/03/2021) qualifica o encerramento como direito subjetivo das partes “desde que observada a prévia e regular notificação”. No caso dos autos, </w:t>
+      </w:r>
+      <w:r>
+        <w:rPr>
+          <w:b/>
+          <w:bCs/>
+          <w:u w:val="single"/>
+          <w:shd w:fill="CFE2F3" w:color="auto" w:val="clear"/>
+        </w:rPr>
+        <w:t xml:space="preserve">nenhuma das duas condições foi atendida</w:t>
+      </w:r>
+      <w:r>
+        <w:t xml:space="preserve">: as contas foram encerradas sem comunicação prévia e o saldo jamais foi devolvido. O precedente que a ré certamente invocará, portanto, confirma a ilicitude de sua conduta.</w:t>
+      </w:r>
+    </w:p>
+    <w:p>
+      <w:pPr>
+        <w:spacing w:after="60" w:line="360"/>
+        <w:ind w:firstLine="850"/>
+        <w:jc w:val="both"/>
+      </w:pPr>
+      <w:r>
+        <w:t xml:space="preserve">O abuso decorre do conjunto das circunstâncias: (i) ausência de indicação do motivo concreto da restrição; (ii) encerramento sem comunicação prévia; (iii) manutenção do bloqueio por quase dois anos, sem prazo definido; e (iv) confissão da própria ré, perante o PROCON, de que “não é possível desbloquear os valores”, sem apresentar alternativa para restituí-los. A menção genérica a “medidas de segurança” e “indício de ilicitude” não supre o dever de informação clara e adequada (art. 6º, III, do CDC).</w:t>
+      </w:r>
+    </w:p>
+    <w:p>
+      <w:pPr>
+        <w:spacing w:after="60" w:line="360"/>
+        <w:ind w:firstLine="850"/>
+        <w:jc w:val="both"/>
+      </w:pPr>
+      <w:r>
+        <w:t xml:space="preserve">As cláusulas 5.10, 5.15.3 e 14.4, invocadas pela ré, não podem ser interpretadas de forma absoluta. Sua aplicação deve observar a boa-fé objetiva e a função social do contrato (arts. 421 e 422 do Código Civil) e, nos termos do art. 47 do CDC, ser interpretada da maneira mais favorável ao consumidor, não se prestando a legitimar a retenção indefinida de valores de titularidade dos autores.</w:t>
+      </w:r>
+    </w:p>
+    <w:p>
+      <w:pPr>
+        <w:spacing w:after="60" w:line="360"/>
+        <w:ind w:firstLine="850"/>
+        <w:jc w:val="both"/>
+      </w:pPr>
+      <w:r>
+        <w:t xml:space="preserve">Mesmo que afastada a incidência do diploma consumerista em relação à segunda autora, a conclusão seria a mesma, pois a retenção de valores alheios sem causa jurídica configura ato ilícito e enriquecimento sem causa (arts. 186, 187, 884 e 927 do Código Civil).</w:t>
       </w:r>
     </w:p>
     <w:p>
@@ -937,6 +909,64 @@
           <w:i/>
           <w:iCs/>
         </w:rPr>
+        <w:t xml:space="preserve">d.	</w:t>
+      </w:r>
+      <w:r>
+        <w:rPr>
+          <w:b/>
+          <w:bCs/>
+          <w:i/>
+          <w:iCs/>
+        </w:rPr>
+        <w:t xml:space="preserve">Da restituição dos saldos e da exibição dos extratos:</w:t>
+      </w:r>
+    </w:p>
+    <w:p>
+      <w:pPr>
+        <w:spacing w:after="60" w:line="360"/>
+        <w:ind w:firstLine="850"/>
+        <w:jc w:val="both"/>
+      </w:pPr>
+      <w:r>
+        <w:t xml:space="preserve">Os autores têm direito à restituição integral dos saldos existentes em ambas as contas na data do encerramento, com correção monetária desde 04/11/2024 e juros de mora desde a citação (arts. 389, 405 e 406 do Código Civil, na redação da Lei nº 14.905/2024).</w:t>
+      </w:r>
+    </w:p>
+    <w:p>
+      <w:pPr>
+        <w:spacing w:after="60" w:line="360"/>
+        <w:ind w:firstLine="850"/>
+        <w:jc w:val="both"/>
+      </w:pPr>
+      <w:r>
+        <w:t xml:space="preserve">Como o valor exato depende de documentos que estão exclusivamente em poder da ré, o pedido é formulado de forma genérica quanto ao montante, o que é admitido quando não for possível determinar, desde logo, a extensão da obrigação (art. 14, § 2º, da Lei nº 9.099/1995 e art. 324, § 1º, III, do CPC), indicando-se como estimativa o valor de R$ 3.500,00.</w:t>
+      </w:r>
+    </w:p>
+    <w:p>
+      <w:pPr>
+        <w:spacing w:after="60" w:line="360"/>
+        <w:ind w:firstLine="850"/>
+        <w:jc w:val="both"/>
+      </w:pPr>
+      <w:r>
+        <w:t xml:space="preserve">Requer-se, ainda, que a ré seja compelida a exibir os extratos completos das duas contas, desde a abertura até o encerramento, bem como os documentos relativos ao bloqueio e ao encerramento (arts. 396 e 399, I e III, do CPC). Em caso de recusa ou omissão, deverão ser admitidos como verdadeiros os fatos que os autores pretendem provar, prevalecendo o valor estimado nesta inicial (art. 400 do CPC).</w:t>
+      </w:r>
+    </w:p>
+    <w:p>
+      <w:pPr>
+        <w:keepNext/>
+        <w:tabs>
+          <w:tab w:val="left" w:pos="700"/>
+        </w:tabs>
+        <w:spacing w:after="160" w:before="240" w:line="360"/>
+        <w:ind w:left="700" w:hanging="400"/>
+      </w:pPr>
+      <w:r>
+        <w:rPr>
+          <w:b/>
+          <w:bCs/>
+          <w:i/>
+          <w:iCs/>
+        </w:rPr>
         <w:t xml:space="preserve">e.	</w:t>
       </w:r>
       <w:r>
@@ -956,7 +986,7 @@
         <w:jc w:val="both"/>
       </w:pPr>
       <w:r>
-        <w:t xml:space="preserve">A conduta da ré ultrapassa o mero inadimplemento contratual. O primeiro autor, pequeno comerciante, está privado de recursos próprios há quase dois anos, sem informação clara sobre a causa da restrição ou sobre o destino dos valores, e foi obrigado a percorrer o atendimento telefônico da ré, aguardar respostas que nunca vieram e recorrer ao PROCON, sem êxito. Como assentou a 1ª Turma Recursal do TJPI no precedente acima transcrito, a privação injustificada do acesso a recursos financeiros do consumidor ultrapassa o mero dissabor cotidiano. A situação caracteriza, ainda, o </w:t>
+        <w:t xml:space="preserve">A conduta da ré ultrapassa o mero inadimplemento contratual. O primeiro autor, pequeno comerciante, está privado de recursos próprios há quase dois anos, sem informação clara sobre a causa da restrição ou sobre o destino dos valores, e foi obrigado a percorrer o atendimento telefônico da ré, aguardar respostas que nunca vieram e recorrer ao PROCON, sem êxito. Como assentaram a 1ª e a 3ª Turmas Recursais do TJPI nos precedentes acima transcritos, a privação injustificada do acesso a recursos financeiros do consumidor ultrapassa o mero dissabor cotidiano. A situação caracteriza, ainda, o </w:t>
       </w:r>
       <w:r>
         <w:rPr>
@@ -1406,7 +1436,7 @@
           <w:szCs w:val="22"/>
           <w:shd w:fill="FFF200" w:color="auto" w:val="clear"/>
         </w:rPr>
-        <w:t xml:space="preserve">[Doc. 10 – Inteiro teor do AgInt no AREsp nº 2.607.102/GO, do AREsp nº 2.956.052/SP, do AgInt no AREsp nº 1.478.859/SP e do RI nº 0800939-21.2025.8.18.0057 (TJPI).]</w:t>
+        <w:t xml:space="preserve">[Doc. 10 – Inteiro teor do AgInt no AREsp nº 2.607.102/GO, do AREsp nº 2.956.052/SP, do AgInt no AREsp nº 1.478.859/SP e dos RIs nº 0800939-21.2025.8.18.0057 e nº 0803814-42.2022.8.18.0162 (TJPI).]</w:t>
       </w:r>
     </w:p>
     <w:p>

</xml_diff>

<commit_message>
Inicial PagBank: ajusta a descrição do precedente da 3ª Turma Recursal ao inteiro teor
Co-Authored-By: Claude Opus 5.5 <noreply@anthropic.com>
Claude-Session: https://claude.ai/code/session_01SFjamS7EZogQCva5nedbPz
</commit_message>
<xml_diff>
--- a/Inicial - Pedro Acelino e Moura x PagBank/Petição inicial - Pedro Acelino e Moura x PagBank.docx
+++ b/Inicial - Pedro Acelino e Moura x PagBank/Petição inicial - Pedro Acelino e Moura x PagBank.docx
@@ -670,7 +670,19 @@
         <w:jc w:val="both"/>
       </w:pPr>
       <w:r>
-        <w:t xml:space="preserve">O entendimento não é isolado: a 3ª Turma Recursal do TJPI, ao examinar a retenção de saldo de conta digital, também reconheceu a falha na prestação do serviço, o dever de ressarcir o cliente e os danos morais:</w:t>
+        <w:t xml:space="preserve">O entendimento não é isolado. A 3ª Turma Recursal do TJPI, em caso no qual a instituição reteve o saldo da conta digital do cliente sem causa jurídica válida (a pretexto de quitar acordo que jamais fora celebrado), manteve a sentença que condenou o banco a </w:t>
+      </w:r>
+      <w:r>
+        <w:rPr>
+          <w:b/>
+          <w:bCs/>
+          <w:u w:val="single"/>
+          <w:shd w:fill="CFE2F3" w:color="auto" w:val="clear"/>
+        </w:rPr>
+        <w:t xml:space="preserve">restituir integralmente o valor retido</w:t>
+      </w:r>
+      <w:r>
+        <w:t xml:space="preserve"> e a indenizar os danos morais:</w:t>
       </w:r>
     </w:p>
     <w:p>

</xml_diff>

<commit_message>
Inicial PagBank: ajusta fatos e cláusulas ao teor da resposta ao PROCON
Co-Authored-By: Claude Opus 5.5 <noreply@anthropic.com>
Claude-Session: https://claude.ai/code/session_01SFjamS7EZogQCva5nedbPz
</commit_message>
<xml_diff>
--- a/Inicial - Pedro Acelino e Moura x PagBank/Petição inicial - Pedro Acelino e Moura x PagBank.docx
+++ b/Inicial - Pedro Acelino e Moura x PagBank/Petição inicial - Pedro Acelino e Moura x PagBank.docx
@@ -328,7 +328,7 @@
         <w:t xml:space="preserve">PROCON itinerante de Miguel Alves-PI (protocolo nº 2503002600200036301)</w:t>
       </w:r>
       <w:r>
-        <w:t xml:space="preserve">. Na resposta, datada de 20/03/2025, a ré não solucionou a controvérsia e manteve-se genérica quanto aos fundamentos da retenção. Na oportunidade, a ré:</w:t>
+        <w:t xml:space="preserve">. Na resposta, datada de 20/03/2025 e apresentada pelo grupo econômico da ré (PagBank Participações Ltda.), não houve solução da controvérsia e os fundamentos da retenção permaneceram genéricos. Na oportunidade, a empresa:</w:t>
       </w:r>
     </w:p>
     <w:p>
@@ -344,7 +344,7 @@
         <w:t xml:space="preserve">a)	</w:t>
       </w:r>
       <w:r>
-        <w:t xml:space="preserve">limitou-se a mencionar, de forma vaga, a adoção de “medidas de segurança” e a existência de “indício de ilicitude”, sem indicar a conduta concreta que teria motivado o bloqueio;</w:t>
+        <w:t xml:space="preserve">limitou-se a afirmar que, “por medidas de segurança, foi realizado o encerramento da conta e consequente bloqueio do saldo”, sem indicar a conduta concreta que teria motivado a medida;</w:t>
       </w:r>
     </w:p>
     <w:p>
@@ -388,7 +388,7 @@
         <w:t xml:space="preserve">c)	</w:t>
       </w:r>
       <w:r>
-        <w:t xml:space="preserve">indicou apenas o canal “SOS BLOQUEIO” como meio de atendimento, sem providência concreta capaz de solucionar a retenção; e</w:t>
+        <w:t xml:space="preserve">indicou apenas o canal telefônico “SOS BLOQUEIO” como meio de atendimento, sem providência concreta capaz de solucionar a retenção; e</w:t>
       </w:r>
     </w:p>
     <w:p>
@@ -404,7 +404,7 @@
         <w:t xml:space="preserve">d)	</w:t>
       </w:r>
       <w:r>
-        <w:t xml:space="preserve">amparou a manutenção do bloqueio em disposições contratuais genéricas (cláusulas 5.10, 5.15.3 e 14.4), sem individualizar a conduta atribuída aos autores, a razão específica da restrição ou qualquer prazo para regularização.</w:t>
+        <w:t xml:space="preserve">transcreveu cláusulas contratuais genéricas (5.10, 5.15.3 e 14.4), sem individualizar a conduta atribuída aos autores, a razão específica da restrição ou qualquer prazo para regularização.</w:t>
       </w:r>
     </w:p>
     <w:p>
@@ -882,17 +882,81 @@
         <w:jc w:val="both"/>
       </w:pPr>
       <w:r>
-        <w:t xml:space="preserve">O abuso decorre do conjunto das circunstâncias: (i) ausência de indicação do motivo concreto da restrição; (ii) encerramento sem comunicação prévia; (iii) manutenção do bloqueio por quase dois anos, sem prazo definido; e (iv) confissão da própria ré, perante o PROCON, de que “não é possível desbloquear os valores”, sem apresentar alternativa para restituí-los. A menção genérica a “medidas de segurança” e “indício de ilicitude” não supre o dever de informação clara e adequada (art. 6º, III, do CDC).</w:t>
-      </w:r>
-    </w:p>
-    <w:p>
-      <w:pPr>
-        <w:spacing w:after="60" w:line="360"/>
-        <w:ind w:firstLine="850"/>
-        <w:jc w:val="both"/>
-      </w:pPr>
-      <w:r>
-        <w:t xml:space="preserve">As cláusulas 5.10, 5.15.3 e 14.4, invocadas pela ré, não podem ser interpretadas de forma absoluta. Sua aplicação deve observar a boa-fé objetiva e a função social do contrato (arts. 421 e 422 do Código Civil) e, nos termos do art. 47 do CDC, ser interpretada da maneira mais favorável ao consumidor, não se prestando a legitimar a retenção indefinida de valores de titularidade dos autores.</w:t>
+        <w:t xml:space="preserve">O abuso decorre do conjunto das circunstâncias: (i) ausência de indicação do motivo concreto da restrição; (ii) encerramento sem comunicação prévia; (iii) manutenção do bloqueio por quase dois anos, sem prazo definido; e (iv) confissão da própria ré, perante o PROCON, de que “não é possível desbloquear os valores”, sem apresentar alternativa para restituí-los. A menção genérica a “medidas de segurança”, acompanhada da mera transcrição de cláusulas contratuais, não supre o dever de informação clara e adequada (art. 6º, III, do CDC).</w:t>
+      </w:r>
+    </w:p>
+    <w:p>
+      <w:pPr>
+        <w:spacing w:after="60" w:line="360"/>
+        <w:ind w:firstLine="850"/>
+        <w:jc w:val="both"/>
+      </w:pPr>
+      <w:r>
+        <w:t xml:space="preserve">Nem mesmo as cláusulas invocadas pela ré na resposta ao PROCON amparam a retenção. Ao contrário, elas a desautorizam:</w:t>
+      </w:r>
+    </w:p>
+    <w:p>
+      <w:pPr>
+        <w:pBdr>
+          <w:top w:val="single" w:color="9AA0A6" w:sz="4" w:space="6"/>
+          <w:bottom w:val="single" w:color="9AA0A6" w:sz="4" w:space="6"/>
+        </w:pBdr>
+        <w:spacing w:after="200" w:before="160" w:line="240"/>
+        <w:ind w:left="2270" w:right="570"/>
+        <w:jc w:val="both"/>
+      </w:pPr>
+      <w:r>
+        <w:rPr>
+          <w:i/>
+          <w:iCs/>
+          <w:sz w:val="18"/>
+          <w:szCs w:val="18"/>
+        </w:rPr>
+        <w:t xml:space="preserve">5.10. Se houver indício de ilicitude, fraude ou violação ao presente contrato por parte do contratante, poderá o PagSeguro recusar-se a incluir créditos no registro de serviço do contratante, bloqueando referido registro de serviço e suspendendo quaisquer transações de comércio eletrônico, pagamentos e movimentações, até que se esclareça a situação, bem como a tomar as providências que julgar necessárias junto às autoridades competentes, caso não se esclareça a situação em prazo razoável. [...] 14.4. Qualquer das partes poderá rescindir o presente contrato a qualquer momento durante seu período de vigência, mediante cancelamento do Serviço. [...] 5.15.3. Sem prejuízo das cláusulas anteriores, poderá o PAGSEGURO, a seu exclusivo critério, reter o saldo existente no Registro de Serviço do Vendedor, em valor suficiente a cobrir eventuais riscos que possam ser gerados aos Compradores e/ao próprio PAGSEGURO em razão das Transações realizadas por meio do Serviço.</w:t>
+      </w:r>
+    </w:p>
+    <w:p>
+      <w:pPr>
+        <w:spacing w:after="60" w:line="360"/>
+        <w:ind w:firstLine="850"/>
+        <w:jc w:val="both"/>
+      </w:pPr>
+      <w:r>
+        <w:t xml:space="preserve">A cláusula 5.10 pressupõe </w:t>
+      </w:r>
+      <w:r>
+        <w:rPr>
+          <w:b/>
+          <w:bCs/>
+          <w:u w:val="single"/>
+          <w:shd w:fill="CFE2F3" w:color="auto" w:val="clear"/>
+        </w:rPr>
+        <w:t xml:space="preserve">indício concreto</w:t>
+      </w:r>
+      <w:r>
+        <w:t xml:space="preserve"> de ilicitude, que a ré jamais apontou, e autoriza bloqueio apenas </w:t>
+      </w:r>
+      <w:r>
+        <w:rPr>
+          <w:b/>
+          <w:bCs/>
+          <w:u w:val="single"/>
+          <w:shd w:fill="CFE2F3" w:color="auto" w:val="clear"/>
+        </w:rPr>
+        <w:t xml:space="preserve">provisório</w:t>
+      </w:r>
+      <w:r>
+        <w:t xml:space="preserve">, “até que se esclareça a situação”, devendo a instituição, se não esclarecida “em prazo razoável”, levar o caso às autoridades competentes. Passados quase dois anos, a ré nem esclareceu a situação, nem comunicou aos autores qualquer providência junto a autoridades. A cláusula 14.4 trata apenas da rescisão do contrato e nada dispõe sobre a apropriação do saldo. Já a cláusula 5.15.3 limita a retenção ao valor “suficiente a cobrir eventuais riscos” decorrentes das transações, o que pressupõe a indicação de risco concreto (como estornos ou contestações de compradores) e jamais autoriza a retenção integral e por tempo indeterminado de todo o saldo, sobretudo após o encerramento do contrato, quando não há mais transações em curso.</w:t>
+      </w:r>
+    </w:p>
+    <w:p>
+      <w:pPr>
+        <w:spacing w:after="60" w:line="360"/>
+        <w:ind w:firstLine="850"/>
+        <w:jc w:val="both"/>
+      </w:pPr>
+      <w:r>
+        <w:t xml:space="preserve">De todo modo, cláusulas redigidas unilateralmente pelo fornecedor devem ser interpretadas da maneira mais favorável ao consumidor (art. 47 do CDC) e à luz da boa-fé objetiva e da função social do contrato (arts. 421 e 422 do Código Civil). Lidas como pretende a ré, isto é, como autorização para reter indefinidamente, “a seu exclusivo critério”, recursos do cliente, seriam nulas de pleno direito, por colocarem o consumidor em desvantagem exagerada e sujeitarem a obrigação ao puro arbítrio de uma das partes (art. 51, IV, do CDC e art. 122 do Código Civil).</w:t>
       </w:r>
     </w:p>
     <w:p>
@@ -1032,7 +1096,7 @@
         <w:t xml:space="preserve">Súmula 227 do STJ</w:t>
       </w:r>
       <w:r>
-        <w:t xml:space="preserve">). O bloqueio súbito da conta empresarial, por meio da qual eram movimentadas as receitas do estabelecimento, sob a imputação genérica de “indício de ilicitude”, comprometeu a organização financeira do negócio e atingiu sua honra objetiva.</w:t>
+        <w:t xml:space="preserve">). O bloqueio súbito da conta empresarial, por meio da qual eram movimentadas as receitas do estabelecimento, sob a genérica invocação de “medidas de segurança”, comprometeu a organização financeira do negócio e atingiu sua honra objetiva.</w:t>
       </w:r>
     </w:p>
     <w:p>
@@ -1416,7 +1480,7 @@
           <w:szCs w:val="22"/>
           <w:shd w:fill="FFF200" w:color="auto" w:val="clear"/>
         </w:rPr>
-        <w:t xml:space="preserve">[Doc. 08 – Reclamação no PROCON (protocolo nº 2503002600200036301) e resposta da ré de 20/03/2025;]</w:t>
+        <w:t xml:space="preserve">[Doc. 08 – Reclamação no PROCON (protocolo nº 2503002600200036301) e resposta de 20/03/2025;]</w:t>
       </w:r>
     </w:p>
     <w:p>

</xml_diff>

<commit_message>
Inicial PagBank: incorpora e-mail de encerramento (04/11/2024) e orientação do PROCON
Co-Authored-By: Claude Opus 5.5 <noreply@anthropic.com>
Claude-Session: https://claude.ai/code/session_01SFjamS7EZogQCva5nedbPz
</commit_message>
<xml_diff>
--- a/Inicial - Pedro Acelino e Moura x PagBank/Petição inicial - Pedro Acelino e Moura x PagBank.docx
+++ b/Inicial - Pedro Acelino e Moura x PagBank/Petição inicial - Pedro Acelino e Moura x PagBank.docx
@@ -39,7 +39,7 @@
         <w:t xml:space="preserve">PEDRO ACELINO E MOURA</w:t>
       </w:r>
       <w:r>
-        <w:t xml:space="preserve">, brasileiro, comerciante, solteiro, portador do CPF nº 009.222.913-14, nascido em 15/04/1984, filho de Maria da Natividade Moura e de Pedro Acelino da Silva, residente e domiciliado na Rua Rio Grande do Sul, nº 3389, bairro São Miguel, Miguel Alves-PI, CEP: 64.130-000, e </w:t>
+        <w:t xml:space="preserve">, brasileiro, comerciante, solteiro, portador do CPF nº 009.222.913-14, nascido em 15/04/1984, filho de Maria da Natividade Moura e de Pedro Acelino da Silva, residente e domiciliado na Rua Rio Grande do Sul, nº 3389, bairro São Miguel, Miguel Alves-PI, CEP: 64.130-000, endereço eletrônico pedroacelino1984@gmail.com, e </w:t>
       </w:r>
       <w:r>
         <w:rPr>
@@ -284,7 +284,41 @@
         <w:t xml:space="preserve">deixando de oferecer qualquer meio para a devolução dos valores</w:t>
       </w:r>
       <w:r>
-        <w:t xml:space="preserve">. Desde então, os autores não têm acesso aos aplicativos, aos extratos nem aos recursos que lhes pertencem.</w:t>
+        <w:t xml:space="preserve">.</w:t>
+      </w:r>
+    </w:p>
+    <w:p>
+      <w:pPr>
+        <w:spacing w:after="60" w:line="360"/>
+        <w:ind w:firstLine="850"/>
+        <w:jc w:val="both"/>
+      </w:pPr>
+      <w:r>
+        <w:t xml:space="preserve">A única comunicação recebida foi um </w:t>
+      </w:r>
+      <w:r>
+        <w:rPr>
+          <w:b/>
+          <w:bCs/>
+          <w:u w:val="single"/>
+          <w:shd w:fill="CFE2F3" w:color="auto" w:val="clear"/>
+        </w:rPr>
+        <w:t xml:space="preserve">e-mail automático enviado às 18h33 do próprio dia 04/11/2024</w:t>
+      </w:r>
+      <w:r>
+        <w:t xml:space="preserve">, com o assunto “Sua conta PagBank foi encerrada”, informando que a conta “foi encerrada em 04/11/2024, incluindo máquinas, produtos e serviços contratados conforme determinações do Banco Central previstas na cláusula 14.4” do contrato. A mensagem, posterior ao encerramento, não indicou motivo algum e </w:t>
+      </w:r>
+      <w:r>
+        <w:rPr>
+          <w:b/>
+          <w:bCs/>
+          <w:u w:val="single"/>
+          <w:shd w:fill="CFE2F3" w:color="auto" w:val="clear"/>
+        </w:rPr>
+        <w:t xml:space="preserve">nada informou sobre o saldo existente</w:t>
+      </w:r>
+      <w:r>
+        <w:t xml:space="preserve"> ou sobre a forma de resgatá-lo. Desde então, os autores não têm acesso aos aplicativos, aos extratos nem aos recursos que lhes pertencem.</w:t>
       </w:r>
     </w:p>
     <w:p>
@@ -405,6 +439,16 @@
       </w:r>
       <w:r>
         <w:t xml:space="preserve">transcreveu cláusulas contratuais genéricas (5.10, 5.15.3 e 14.4), sem individualizar a conduta atribuída aos autores, a razão específica da restrição ou qualquer prazo para regularização.</w:t>
+      </w:r>
+    </w:p>
+    <w:p>
+      <w:pPr>
+        <w:spacing w:after="60" w:line="360"/>
+        <w:ind w:firstLine="850"/>
+        <w:jc w:val="both"/>
+      </w:pPr>
+      <w:r>
+        <w:t xml:space="preserve">Ao encaminhar a resposta ao autor, em 01/04/2025, o próprio PROCON registrou que a defesa não trazia explicação concreta e o orientou a, “caso não haja explicações convincentes”, procurar o Juizado Especial e ajuizar ação.</w:t>
       </w:r>
     </w:p>
     <w:p>
@@ -618,7 +662,7 @@
         <w:jc w:val="both"/>
       </w:pPr>
       <w:r>
-        <w:t xml:space="preserve">Na mesma linha, a regulamentação do Banco Central sobre contas de pagamento (Resolução BCB nº 96/2021, art. 12) impõe à instituição, no encerramento da conta, o dever de comunicar ao titular a intenção de rescindir o contrato e de possibilitar a transferência do saldo remanescente para conta por ele indicada ou de colocá-lo à sua disposição. A ré fez o oposto: encerrou as contas e manteve os valores bloqueados, sem mecanismo algum para sua restituição.</w:t>
+        <w:t xml:space="preserve">Na mesma linha, a regulamentação do Banco Central sobre contas de pagamento (Resolução BCB nº 96/2021, art. 12) impõe à instituição, no encerramento da conta, o dever de comunicar ao titular a intenção de rescindir o contrato e de possibilitar a transferência do saldo remanescente para conta por ele indicada ou de colocá-lo à sua disposição. A ré fez o oposto: encerrou as contas sem aviso prévio, comunicou o fato por e-mail automático enviado horas depois, que sequer menciona o saldo, e manteve os valores bloqueados, sem mecanismo algum para sua restituição.</w:t>
       </w:r>
     </w:p>
     <w:p>
@@ -872,17 +916,29 @@
         <w:t xml:space="preserve">nenhuma das duas condições foi atendida</w:t>
       </w:r>
       <w:r>
-        <w:t xml:space="preserve">: as contas foram encerradas sem comunicação prévia e o saldo jamais foi devolvido. O precedente que a ré certamente invocará, portanto, confirma a ilicitude de sua conduta.</w:t>
-      </w:r>
-    </w:p>
-    <w:p>
-      <w:pPr>
-        <w:spacing w:after="60" w:line="360"/>
-        <w:ind w:firstLine="850"/>
-        <w:jc w:val="both"/>
-      </w:pPr>
-      <w:r>
-        <w:t xml:space="preserve">O abuso decorre do conjunto das circunstâncias: (i) ausência de indicação do motivo concreto da restrição; (ii) encerramento sem comunicação prévia; (iii) manutenção do bloqueio por quase dois anos, sem prazo definido; e (iv) confissão da própria ré, perante o PROCON, de que “não é possível desbloquear os valores”, sem apresentar alternativa para restituí-los. A menção genérica a “medidas de segurança”, acompanhada da mera transcrição de cláusulas contratuais, não supre o dever de informação clara e adequada (art. 6º, III, do CDC).</w:t>
+        <w:t xml:space="preserve">: a única comunicação foi o e-mail automático enviado às 18h33 do próprio dia 04/11/2024, informando que a conta “foi encerrada”, isto é, comunicação </w:t>
+      </w:r>
+      <w:r>
+        <w:rPr>
+          <w:b/>
+          <w:bCs/>
+          <w:u w:val="single"/>
+          <w:shd w:fill="CFE2F3" w:color="auto" w:val="clear"/>
+        </w:rPr>
+        <w:t xml:space="preserve">posterior</w:t>
+      </w:r>
+      <w:r>
+        <w:t xml:space="preserve">, e não prévia; e o saldo jamais foi devolvido. O precedente que a ré certamente invocará, portanto, confirma a ilicitude de sua conduta.</w:t>
+      </w:r>
+    </w:p>
+    <w:p>
+      <w:pPr>
+        <w:spacing w:after="60" w:line="360"/>
+        <w:ind w:firstLine="850"/>
+        <w:jc w:val="both"/>
+      </w:pPr>
+      <w:r>
+        <w:t xml:space="preserve">O abuso decorre do conjunto das circunstâncias: (i) ausência de indicação do motivo concreto da restrição; (ii) encerramento sem comunicação prévia, noticiado apenas por e-mail automático posterior, silente quanto ao saldo; (iii) manutenção do bloqueio por quase dois anos, sem prazo definido; e (iv) confissão da própria ré, perante o PROCON, de que “não é possível desbloquear os valores”, sem apresentar alternativa para restituí-los. A menção genérica a “medidas de segurança”, acompanhada da mera transcrição de cláusulas contratuais, não supre o dever de informação clara e adequada (art. 6º, III, do CDC).</w:t>
       </w:r>
     </w:p>
     <w:p>
@@ -1448,7 +1504,7 @@
           <w:szCs w:val="22"/>
           <w:shd w:fill="FFF200" w:color="auto" w:val="clear"/>
         </w:rPr>
-        <w:t xml:space="preserve">[Doc. 06 – Registros do encerramento das contas e e-mails recebidos da ré;]</w:t>
+        <w:t xml:space="preserve">[Doc. 06 – E-mail da ré de 04/11/2024, 18h33 (“Sua conta PagBank foi encerrada”);]</w:t>
       </w:r>
     </w:p>
     <w:p>
@@ -1480,7 +1536,7 @@
           <w:szCs w:val="22"/>
           <w:shd w:fill="FFF200" w:color="auto" w:val="clear"/>
         </w:rPr>
-        <w:t xml:space="preserve">[Doc. 08 – Reclamação no PROCON (protocolo nº 2503002600200036301) e resposta de 20/03/2025;]</w:t>
+        <w:t xml:space="preserve">[Doc. 08 – Reclamação no PROCON (protocolo nº 2503002600200036301), resposta de 20/03/2025 e e-mails do PROCON de 01/04/2025 e 16/06/2025;]</w:t>
       </w:r>
     </w:p>
     <w:p>

</xml_diff>

<commit_message>
Inicial PagBank: converte para procedimento comum, só pessoa física, com pedidos sobre as duas contas e gratuidade
Co-Authored-By: Claude Opus 5.5 <noreply@anthropic.com>
Claude-Session: https://claude.ai/code/session_01SFjamS7EZogQCva5nedbPz
</commit_message>
<xml_diff>
--- a/Inicial - Pedro Acelino e Moura x PagBank/Petição inicial - Pedro Acelino e Moura x PagBank.docx
+++ b/Inicial - Pedro Acelino e Moura x PagBank/Petição inicial - Pedro Acelino e Moura x PagBank.docx
@@ -39,27 +39,7 @@
         <w:t xml:space="preserve">PEDRO ACELINO E MOURA</w:t>
       </w:r>
       <w:r>
-        <w:t xml:space="preserve">, brasileiro, comerciante, solteiro, portador do CPF nº 009.222.913-14, nascido em 15/04/1984, filho de Maria da Natividade Moura e de Pedro Acelino da Silva, residente e domiciliado na Rua Rio Grande do Sul, nº 3389, bairro São Miguel, Miguel Alves-PI, CEP: 64.130-000, endereço eletrônico pedroacelino1984@gmail.com, e </w:t>
-      </w:r>
-      <w:r>
-        <w:rPr>
-          <w:b/>
-          <w:bCs/>
-        </w:rPr>
-        <w:t xml:space="preserve">PEDRO ACELINO E MOURA ME</w:t>
-      </w:r>
-      <w:r>
-        <w:t xml:space="preserve">, nome fantasia </w:t>
-      </w:r>
-      <w:r>
-        <w:rPr>
-          <w:b/>
-          <w:bCs/>
-        </w:rPr>
-        <w:t xml:space="preserve">DEPÓSITO BETS BAR</w:t>
-      </w:r>
-      <w:r>
-        <w:t xml:space="preserve">, inscrita no CNPJ sob o nº 42.828.031/0001-85, com sede na Rua Rio Grande do Sul, nº 3389, bairro São Miguel, Miguel Alves-PI, CEP: 64.130-000, neste ato representada por seu titular, PEDRO ACELINO E MOURA, acima qualificado, por meio de seu advogado, ANTÔNIO DE PÁDUA SANTOS NETO, inscrito nos quadros da OAB-PI sob o nº 21.320, constituído mediante procuração em anexo, com endereço físico na Rua Rio Grande do Sul, nº 1641, bairro São Miguel, Miguel Alves-PI, CEP: 64.130-000, e eletrônico: paduanetojus@gmail.com, vêm, à presença de Vossa Excelência, propor a presente</w:t>
+        <w:t xml:space="preserve">, brasileiro, comerciante, solteiro, portador do CPF nº 009.222.913-14, nascido em 15/04/1984, filho de Maria da Natividade Moura e de Pedro Acelino da Silva, residente e domiciliado na Rua Rio Grande do Sul, nº 3389, bairro São Miguel, Miguel Alves-PI, CEP: 64.130-000, endereço eletrônico pedroacelino1984@gmail.com, titular da firma individual PEDRO ACELINO E MOURA ME (Depósito Bets Bar), inscrita no CNPJ sob o nº 42.828.031/0001-85, por meio de seu advogado, ANTÔNIO DE PÁDUA SANTOS NETO, inscrito nos quadros da OAB-PI sob o nº 21.320, constituído mediante procuração em anexo, com endereço físico na Rua Rio Grande do Sul, nº 1641, bairro São Miguel, Miguel Alves-PI, CEP: 64.130-000, e eletrônico: paduanetojus@gmail.com, vem, à presença de Vossa Excelência, propor a presente</w:t>
       </w:r>
     </w:p>
     <w:p>
@@ -150,39 +130,39 @@
           <w:i/>
           <w:iCs/>
         </w:rPr>
-        <w:t xml:space="preserve">Do rito e da legitimidade ativa da microempresa:</w:t>
-      </w:r>
-    </w:p>
-    <w:p>
-      <w:pPr>
-        <w:spacing w:after="60" w:line="360"/>
-        <w:ind w:firstLine="850"/>
-        <w:jc w:val="both"/>
-      </w:pPr>
-      <w:r>
-        <w:t xml:space="preserve">Os autores optam pelo procedimento da Lei nº 9.099/1995. A causa é de menor complexidade e seu valor não excede quarenta salários mínimos (art. 3º, I). A segunda autora, empresária individual enquadrada como microempresa, tem legitimidade para propor ação perante o Juizado Especial Cível, nos termos do </w:t>
-      </w:r>
-      <w:r>
-        <w:rPr>
-          <w:b/>
-          <w:bCs/>
-          <w:u w:val="single"/>
-          <w:shd w:fill="CFE2F3" w:color="auto" w:val="clear"/>
-        </w:rPr>
-        <w:t xml:space="preserve">art. 8º, § 1º, II, da Lei nº 9.099/1995</w:t>
-      </w:r>
-      <w:r>
-        <w:t xml:space="preserve"> e do art. 74 da Lei Complementar nº 123/2006.</w:t>
-      </w:r>
-    </w:p>
-    <w:p>
-      <w:pPr>
-        <w:spacing w:after="60" w:line="360"/>
-        <w:ind w:firstLine="850"/>
-        <w:jc w:val="both"/>
-      </w:pPr>
-      <w:r>
-        <w:t xml:space="preserve">O litisconsórcio ativo justifica-se porque ambas as contas, a de pessoa física e a de pessoa jurídica, foram encerradas pela ré no mesmo ato, na mesma data e pelo mesmo fundamento genérico, havendo comunhão de direitos e identidade de causa de pedir (art. 113, I e III, do CPC).</w:t>
+        <w:t xml:space="preserve">Da gratuidade da justiça:</w:t>
+      </w:r>
+    </w:p>
+    <w:p>
+      <w:pPr>
+        <w:spacing w:after="60" w:line="360"/>
+        <w:ind w:firstLine="850"/>
+        <w:jc w:val="both"/>
+      </w:pPr>
+      <w:r>
+        <w:t xml:space="preserve">O autor é pequeno comerciante e não tem condições de arcar com as custas e despesas processuais sem prejuízo do próprio sustento e de sua família, situação agravada justamente pela retenção, há quase dois anos, dos recursos que mantinha junto à ré. Requer, por isso, a concessão da </w:t>
+      </w:r>
+      <w:r>
+        <w:rPr>
+          <w:b/>
+          <w:bCs/>
+          <w:u w:val="single"/>
+          <w:shd w:fill="CFE2F3" w:color="auto" w:val="clear"/>
+        </w:rPr>
+        <w:t xml:space="preserve">gratuidade da justiça</w:t>
+      </w:r>
+      <w:r>
+        <w:t xml:space="preserve">, nos termos do art. 5º, LXXIV, da Constituição Federal e dos arts. 98 e 99 do CPC, conforme declaração de hipossuficiência e documentos anexos.</w:t>
+      </w:r>
+    </w:p>
+    <w:p>
+      <w:pPr>
+        <w:spacing w:after="60" w:line="360"/>
+        <w:ind w:firstLine="850"/>
+        <w:jc w:val="both"/>
+      </w:pPr>
+      <w:r>
+        <w:t xml:space="preserve">A alegação de insuficiência deduzida por pessoa natural presume-se verdadeira (art. 99, § 3º, do CPC), e a assistência por advogado particular não impede a concessão do benefício (art. 99, § 4º).</w:t>
       </w:r>
     </w:p>
     <w:p>
@@ -210,6 +190,66 @@
           <w:i/>
           <w:iCs/>
         </w:rPr>
+        <w:t xml:space="preserve">Da titularidade do saldo da conta vinculada à firma individual:</w:t>
+      </w:r>
+    </w:p>
+    <w:p>
+      <w:pPr>
+        <w:spacing w:after="60" w:line="360"/>
+        <w:ind w:firstLine="850"/>
+        <w:jc w:val="both"/>
+      </w:pPr>
+      <w:r>
+        <w:t xml:space="preserve">Além da conta de pessoa física, o autor mantinha junto à ré conta vinculada ao CNPJ de sua firma individual, Pedro Acelino e Moura ME (Depósito Bets Bar). O empresário individual é a própria pessoa natural que exerce a atividade empresarial (art. 966 do Código Civil). A inscrição no CNPJ tem finalidade fiscal e cadastral e não cria pessoa jurídica distinta, de modo que o patrimônio da firma individual e o de seu titular são um só.</w:t>
+      </w:r>
+    </w:p>
+    <w:p>
+      <w:pPr>
+        <w:spacing w:after="60" w:line="360"/>
+        <w:ind w:firstLine="850"/>
+        <w:jc w:val="both"/>
+      </w:pPr>
+      <w:r>
+        <w:t xml:space="preserve">Por isso, o autor é o titular dos saldos de </w:t>
+      </w:r>
+      <w:r>
+        <w:rPr>
+          <w:b/>
+          <w:bCs/>
+          <w:u w:val="single"/>
+          <w:shd w:fill="CFE2F3" w:color="auto" w:val="clear"/>
+        </w:rPr>
+        <w:t xml:space="preserve">ambas as contas</w:t>
+      </w:r>
+      <w:r>
+        <w:t xml:space="preserve"> e tem legitimidade para pleitear, em nome próprio, a restituição de todos os valores retidos, inclusive os existentes na conta vinculada ao CNPJ.</w:t>
+      </w:r>
+    </w:p>
+    <w:p>
+      <w:pPr>
+        <w:keepNext/>
+        <w:tabs>
+          <w:tab w:val="left" w:pos="700"/>
+        </w:tabs>
+        <w:spacing w:after="160" w:before="240" w:line="360"/>
+        <w:ind w:left="700" w:hanging="400"/>
+      </w:pPr>
+      <w:r>
+        <w:rPr>
+          <w:b/>
+          <w:bCs/>
+          <w:i/>
+          <w:iCs/>
+        </w:rPr>
+        <w:t xml:space="preserve">c.	</w:t>
+      </w:r>
+      <w:r>
+        <w:rPr>
+          <w:b/>
+          <w:bCs/>
+          <w:i/>
+          <w:iCs/>
+        </w:rPr>
         <w:t xml:space="preserve">Da audiência de conciliação:</w:t>
       </w:r>
     </w:p>
@@ -220,7 +260,7 @@
         <w:jc w:val="both"/>
       </w:pPr>
       <w:r>
-        <w:t xml:space="preserve">Os autores manifestam interesse na audiência de conciliação (arts. 21 e 22 da Lei nº 9.099/1995) e requerem, desde já, sua realização por videoconferência (art. 22, § 2º), considerando que a ré tem sede em outro Estado.</w:t>
+        <w:t xml:space="preserve">Em atenção ao art. 319, VII, do CPC, o autor manifesta interesse na audiência de conciliação (art. 334 do CPC) e requer sua realização por videoconferência (art. 334, § 7º), considerando que a ré tem sede em outro Estado.</w:t>
       </w:r>
     </w:p>
     <w:p>
@@ -250,7 +290,7 @@
         <w:jc w:val="both"/>
       </w:pPr>
       <w:r>
-        <w:t xml:space="preserve">Os autores mantinham, desde 2023, relação contratual com a ré (PagBank), por meio de duas contas: uma de pessoa física, em nome de Pedro Acelino e Moura, e outra de pessoa jurídica, em nome de Pedro Acelino e Moura ME (Depósito Bets Bar), utilizada para movimentar as receitas do estabelecimento comercial.</w:t>
+        <w:t xml:space="preserve">O autor mantinha, desde 2023, relação contratual com a ré (PagBank), por meio de duas contas: uma de pessoa física, em seu nome, e outra vinculada ao CNPJ de sua firma individual, Pedro Acelino e Moura ME (Depósito Bets Bar), utilizada para movimentar as receitas do estabelecimento comercial.</w:t>
       </w:r>
     </w:p>
     <w:p>
@@ -269,7 +309,7 @@
           <w:u w:val="single"/>
           <w:shd w:fill="CFE2F3" w:color="auto" w:val="clear"/>
         </w:rPr>
-        <w:t xml:space="preserve">04/11/2024, a ré encerrou unilateralmente ambas as contas</w:t>
+        <w:t xml:space="preserve">04/11/2024, a ré encerrou unilateralmente ambas as contas do autor</w:t>
       </w:r>
       <w:r>
         <w:t xml:space="preserve">, sem comunicação prévia e sem justificativa adequada, impedindo o acesso aos saldos existentes e </w:t>
@@ -318,29 +358,29 @@
         <w:t xml:space="preserve">nada informou sobre o saldo existente</w:t>
       </w:r>
       <w:r>
-        <w:t xml:space="preserve"> ou sobre a forma de resgatá-lo. Desde então, os autores não têm acesso aos aplicativos, aos extratos nem aos recursos que lhes pertencem.</w:t>
-      </w:r>
-    </w:p>
-    <w:p>
-      <w:pPr>
-        <w:spacing w:after="60" w:line="360"/>
-        <w:ind w:firstLine="850"/>
-        <w:jc w:val="both"/>
-      </w:pPr>
-      <w:r>
-        <w:t xml:space="preserve">Os autores </w:t>
-      </w:r>
-      <w:r>
-        <w:rPr>
-          <w:b/>
-          <w:bCs/>
-          <w:u w:val="single"/>
-          <w:shd w:fill="CFE2F3" w:color="auto" w:val="clear"/>
-        </w:rPr>
-        <w:t xml:space="preserve">não possuem nenhuma dívida, débito ou obrigação pendente perante a ré</w:t>
-      </w:r>
-      <w:r>
-        <w:t xml:space="preserve"> que justificasse o encerramento ou a retenção. Na tentativa de resolver a questão administrativamente, o autor contatou o atendimento telefônico da ré, sendo informado pelos atendentes de que deveria “aguardar o recebimento de um e-mail”, sem que a instituição estabelecesse prazo ou oferecesse solução concreta.</w:t>
+        <w:t xml:space="preserve"> ou sobre a forma de resgatá-lo. Desde então, o autor não tem acesso aos aplicativos, aos extratos nem aos recursos que lhes pertencem.</w:t>
+      </w:r>
+    </w:p>
+    <w:p>
+      <w:pPr>
+        <w:spacing w:after="60" w:line="360"/>
+        <w:ind w:firstLine="850"/>
+        <w:jc w:val="both"/>
+      </w:pPr>
+      <w:r>
+        <w:t xml:space="preserve">O autor </w:t>
+      </w:r>
+      <w:r>
+        <w:rPr>
+          <w:b/>
+          <w:bCs/>
+          <w:u w:val="single"/>
+          <w:shd w:fill="CFE2F3" w:color="auto" w:val="clear"/>
+        </w:rPr>
+        <w:t xml:space="preserve">não possui nenhuma dívida, débito ou obrigação pendente perante a ré</w:t>
+      </w:r>
+      <w:r>
+        <w:t xml:space="preserve"> que justificasse o encerramento ou a retenção. Na tentativa de resolver a questão administrativamente, contatou o atendimento telefônico da ré, sendo informado pelos atendentes de que deveria “aguardar o recebimento de um e-mail”, sem que a instituição estabelecesse prazo ou oferecesse solução concreta.</w:t>
       </w:r>
     </w:p>
     <w:p>
@@ -438,7 +478,7 @@
         <w:t xml:space="preserve">d)	</w:t>
       </w:r>
       <w:r>
-        <w:t xml:space="preserve">transcreveu cláusulas contratuais genéricas (5.10, 5.15.3 e 14.4), sem individualizar a conduta atribuída aos autores, a razão específica da restrição ou qualquer prazo para regularização.</w:t>
+        <w:t xml:space="preserve">transcreveu cláusulas contratuais genéricas (5.10, 5.15.3 e 14.4), sem individualizar a conduta atribuída ao autor, a razão específica da restrição ou qualquer prazo para regularização.</w:t>
       </w:r>
     </w:p>
     <w:p>
@@ -458,7 +498,7 @@
         <w:jc w:val="both"/>
       </w:pPr>
       <w:r>
-        <w:t xml:space="preserve">Passados quase dois anos do encerramento, os autores continuam sem acesso às contas, sem os saldos e sem informação sobre o valor retido. Por estarem bloqueados os extratos, não conseguem apurar com exatidão o montante existente na data do encerramento, estimando que a soma dos saldos gire em torno de </w:t>
+        <w:t xml:space="preserve">Passados quase dois anos do encerramento, o autor continua sem acesso às contas, sem os saldos e sem informação sobre o valor retido. Por estarem bloqueados os extratos, não consegue apurar com exatidão o montante existente na data do encerramento, estimando que a soma dos saldos das duas contas gire em torno de </w:t>
       </w:r>
       <w:r>
         <w:rPr>
@@ -560,17 +600,17 @@
         <w:jc w:val="both"/>
       </w:pPr>
       <w:r>
-        <w:t xml:space="preserve">O primeiro autor é destinatário final dos serviços contratados (art. 2º do CDC). Quanto à segunda autora, microempresa titularizada por pessoa natural, incide a teoria finalista mitigada, consolidada no Superior Tribunal de Justiça, que admite a aplicação do CDC à pessoa jurídica que demonstra vulnerabilidade técnica, jurídica ou econômica frente ao fornecedor, situação evidente diante de uma das maiores instituições de pagamento do país, que detém com exclusividade os registros das contas e impõe unilateralmente as condições do serviço.</w:t>
-      </w:r>
-    </w:p>
-    <w:p>
-      <w:pPr>
-        <w:spacing w:after="60" w:line="360"/>
-        <w:ind w:firstLine="850"/>
-        <w:jc w:val="both"/>
-      </w:pPr>
-      <w:r>
-        <w:t xml:space="preserve">A ré responde objetivamente pelos defeitos na prestação do serviço (art. 14 do CDC). Presentes a verossimilhança das alegações e a hipossuficiência técnica dos autores, que não têm acesso aos extratos das próprias contas, impõe-se a </w:t>
+        <w:t xml:space="preserve">O autor é destinatário final dos serviços contratados (art. 2º do CDC). A circunstância de uma das contas estar vinculada ao CNPJ de sua firma individual não afasta a proteção consumerista: incide a teoria finalista mitigada, consolidada no Superior Tribunal de Justiça, que admite a aplicação do CDC a quem demonstra vulnerabilidade técnica, jurídica ou econômica frente ao fornecedor, situação evidente de pequeno comerciante diante de uma das maiores instituições de pagamento do país, que detém com exclusividade os registros das contas e impõe unilateralmente as condições do serviço.</w:t>
+      </w:r>
+    </w:p>
+    <w:p>
+      <w:pPr>
+        <w:spacing w:after="60" w:line="360"/>
+        <w:ind w:firstLine="850"/>
+        <w:jc w:val="both"/>
+      </w:pPr>
+      <w:r>
+        <w:t xml:space="preserve">A ré responde objetivamente pelos defeitos na prestação do serviço (art. 14 do CDC). Presentes a verossimilhança das alegações e a hipossuficiência técnica do autor, que não tem acesso aos extratos das próprias contas, impõe-se a </w:t>
       </w:r>
       <w:r>
         <w:rPr>
@@ -582,7 +622,7 @@
         <w:t xml:space="preserve">inversão do ônus da prova</w:t>
       </w:r>
       <w:r>
-        <w:t xml:space="preserve"> (art. 6º, VIII, do CDC), cabendo à ré demonstrar os saldos existentes na data do encerramento, o motivo concreto do encerramento, a comunicação prévia aos titulares e a destinação dada aos valores.</w:t>
+        <w:t xml:space="preserve"> (art. 6º, VIII, do CDC), cabendo à ré demonstrar os saldos existentes na data do encerramento, o motivo concreto do encerramento, a comunicação prévia ao titular e a destinação dada aos valores.</w:t>
       </w:r>
     </w:p>
     <w:p>
@@ -672,7 +712,7 @@
         <w:jc w:val="both"/>
       </w:pPr>
       <w:r>
-        <w:t xml:space="preserve">No âmbito dos Juizados Especiais deste Estado, a 1ª Turma Recursal do TJPI firmou tese no sentido de que a retenção do saldo após o encerramento da conta caracteriza falha na prestação do serviço, </w:t>
+        <w:t xml:space="preserve">A 1ª Turma Recursal do TJPI firmou tese no sentido de que a retenção do saldo após o encerramento da conta caracteriza falha na prestação do serviço, </w:t>
       </w:r>
       <w:r>
         <w:rPr>
@@ -756,7 +796,7 @@
         <w:jc w:val="both"/>
       </w:pPr>
       <w:r>
-        <w:t xml:space="preserve">A ré, portanto, não tem título para reter os valores. Não há débito dos autores, ordem judicial de bloqueio, nem procedimento comunicado aos titulares com indicação da conduta imputada. A retenção por prazo indefinido configura vantagem manifestamente excessiva e prática abusiva (arts. 39, V, e 51, IV, do CDC), além de </w:t>
+        <w:t xml:space="preserve">A ré, portanto, não tem título para reter os valores. Não há débito do autor, ordem judicial de bloqueio, nem procedimento comunicado aos titulares com indicação da conduta imputada. A retenção por prazo indefinido configura vantagem manifestamente excessiva e prática abusiva (arts. 39, V, e 51, IV, do CDC), além de </w:t>
       </w:r>
       <w:r>
         <w:rPr>
@@ -1002,7 +1042,7 @@
         <w:t xml:space="preserve">provisório</w:t>
       </w:r>
       <w:r>
-        <w:t xml:space="preserve">, “até que se esclareça a situação”, devendo a instituição, se não esclarecida “em prazo razoável”, levar o caso às autoridades competentes. Passados quase dois anos, a ré nem esclareceu a situação, nem comunicou aos autores qualquer providência junto a autoridades. A cláusula 14.4 trata apenas da rescisão do contrato e nada dispõe sobre a apropriação do saldo. Já a cláusula 5.15.3 limita a retenção ao valor “suficiente a cobrir eventuais riscos” decorrentes das transações, o que pressupõe a indicação de risco concreto (como estornos ou contestações de compradores) e jamais autoriza a retenção integral e por tempo indeterminado de todo o saldo, sobretudo após o encerramento do contrato, quando não há mais transações em curso.</w:t>
+        <w:t xml:space="preserve">, “até que se esclareça a situação”, devendo a instituição, se não esclarecida “em prazo razoável”, levar o caso às autoridades competentes. Passados quase dois anos, a ré nem esclareceu a situação, nem comunicou ao autor qualquer providência junto a autoridades. A cláusula 14.4 trata apenas da rescisão do contrato e nada dispõe sobre a apropriação do saldo. Já a cláusula 5.15.3 limita a retenção ao valor “suficiente a cobrir eventuais riscos” decorrentes das transações, o que pressupõe a indicação de risco concreto (como estornos ou contestações de compradores) e jamais autoriza a retenção integral e por tempo indeterminado de todo o saldo, sobretudo após o encerramento do contrato, quando não há mais transações em curso.</w:t>
       </w:r>
     </w:p>
     <w:p>
@@ -1022,7 +1062,7 @@
         <w:jc w:val="both"/>
       </w:pPr>
       <w:r>
-        <w:t xml:space="preserve">Mesmo que afastada a incidência do diploma consumerista em relação à segunda autora, a conclusão seria a mesma, pois a retenção de valores alheios sem causa jurídica configura ato ilícito e enriquecimento sem causa (arts. 186, 187, 884 e 927 do Código Civil).</w:t>
+        <w:t xml:space="preserve">Mesmo que se afastasse a incidência do diploma consumerista quanto à conta vinculada ao CNPJ, a conclusão seria a mesma, pois a retenção de valores alheios sem causa jurídica configura ato ilícito e enriquecimento sem causa (arts. 186, 187, 884 e 927 do Código Civil).</w:t>
       </w:r>
     </w:p>
     <w:p>
@@ -1060,27 +1100,27 @@
         <w:jc w:val="both"/>
       </w:pPr>
       <w:r>
-        <w:t xml:space="preserve">Os autores têm direito à restituição integral dos saldos existentes em ambas as contas na data do encerramento, com correção monetária desde 04/11/2024 e juros de mora desde a citação (arts. 389, 405 e 406 do Código Civil, na redação da Lei nº 14.905/2024).</w:t>
-      </w:r>
-    </w:p>
-    <w:p>
-      <w:pPr>
-        <w:spacing w:after="60" w:line="360"/>
-        <w:ind w:firstLine="850"/>
-        <w:jc w:val="both"/>
-      </w:pPr>
-      <w:r>
-        <w:t xml:space="preserve">Como o valor exato depende de documentos que estão exclusivamente em poder da ré, o pedido é formulado de forma genérica quanto ao montante, o que é admitido quando não for possível determinar, desde logo, a extensão da obrigação (art. 14, § 2º, da Lei nº 9.099/1995 e art. 324, § 1º, III, do CPC), indicando-se como estimativa o valor de R$ 3.500,00.</w:t>
-      </w:r>
-    </w:p>
-    <w:p>
-      <w:pPr>
-        <w:spacing w:after="60" w:line="360"/>
-        <w:ind w:firstLine="850"/>
-        <w:jc w:val="both"/>
-      </w:pPr>
-      <w:r>
-        <w:t xml:space="preserve">Requer-se, ainda, que a ré seja compelida a exibir os extratos completos das duas contas, desde a abertura até o encerramento, bem como os documentos relativos ao bloqueio e ao encerramento (arts. 396 e 399, I e III, do CPC). Em caso de recusa ou omissão, deverão ser admitidos como verdadeiros os fatos que os autores pretendem provar, prevalecendo o valor estimado nesta inicial (art. 400 do CPC).</w:t>
+        <w:t xml:space="preserve">O autor tem direito à restituição integral dos saldos existentes em ambas as contas na data do encerramento, com correção monetária desde 04/11/2024 e juros de mora desde a citação (arts. 389, 405 e 406 do Código Civil, na redação da Lei nº 14.905/2024).</w:t>
+      </w:r>
+    </w:p>
+    <w:p>
+      <w:pPr>
+        <w:spacing w:after="60" w:line="360"/>
+        <w:ind w:firstLine="850"/>
+        <w:jc w:val="both"/>
+      </w:pPr>
+      <w:r>
+        <w:t xml:space="preserve">Como o valor exato depende de documentos que estão exclusivamente em poder da ré, o pedido é formulado de forma genérica quanto ao montante, o que é admitido quando não for possível determinar, desde logo, a extensão da obrigação (art. 324, § 1º, III, do CPC), indicando-se como estimativa o valor de R$ 3.500,00.</w:t>
+      </w:r>
+    </w:p>
+    <w:p>
+      <w:pPr>
+        <w:spacing w:after="60" w:line="360"/>
+        <w:ind w:firstLine="850"/>
+        <w:jc w:val="both"/>
+      </w:pPr>
+      <w:r>
+        <w:t xml:space="preserve">Requer-se, ainda, que a ré seja compelida a exibir os extratos completos das duas contas, desde a abertura até o encerramento, bem como os documentos relativos ao bloqueio e ao encerramento (arts. 396 e 399, I e III, do CPC). Em caso de recusa ou omissão, deverão ser admitidos como verdadeiros os fatos que o autor pretende provar, prevalecendo o valor estimado nesta inicial (art. 400 do CPC).</w:t>
       </w:r>
     </w:p>
     <w:p>
@@ -1118,7 +1158,7 @@
         <w:jc w:val="both"/>
       </w:pPr>
       <w:r>
-        <w:t xml:space="preserve">A conduta da ré ultrapassa o mero inadimplemento contratual. O primeiro autor, pequeno comerciante, está privado de recursos próprios há quase dois anos, sem informação clara sobre a causa da restrição ou sobre o destino dos valores, e foi obrigado a percorrer o atendimento telefônico da ré, aguardar respostas que nunca vieram e recorrer ao PROCON, sem êxito. Como assentaram a 1ª e a 3ª Turmas Recursais do TJPI nos precedentes acima transcritos, a privação injustificada do acesso a recursos financeiros do consumidor ultrapassa o mero dissabor cotidiano. A situação caracteriza, ainda, o </w:t>
+        <w:t xml:space="preserve">A conduta da ré ultrapassa o mero inadimplemento contratual. O autor, pequeno comerciante, está privado de recursos próprios há quase dois anos, inclusive dos valores da conta por meio da qual eram movimentadas as receitas de seu estabelecimento, sem informação clara sobre a causa da restrição ou sobre o destino dos valores, e foi obrigado a percorrer o atendimento telefônico da ré, aguardar respostas que nunca vieram e recorrer ao PROCON, sem êxito. Como assentaram a 1ª e a 3ª Turmas Recursais do TJPI nos precedentes acima transcritos, a privação injustificada do acesso a recursos financeiros do consumidor ultrapassa o mero dissabor cotidiano. A situação caracteriza, ainda, o </w:t>
       </w:r>
       <w:r>
         <w:rPr>
@@ -1140,41 +1180,29 @@
         <w:jc w:val="both"/>
       </w:pPr>
       <w:r>
-        <w:t xml:space="preserve">Quanto à segunda autora, a pessoa jurídica pode sofrer dano moral (</w:t>
-      </w:r>
-      <w:r>
-        <w:rPr>
-          <w:b/>
-          <w:bCs/>
-          <w:u w:val="single"/>
-          <w:shd w:fill="CFE2F3" w:color="auto" w:val="clear"/>
-        </w:rPr>
-        <w:t xml:space="preserve">Súmula 227 do STJ</w:t>
-      </w:r>
-      <w:r>
-        <w:t xml:space="preserve">). O bloqueio súbito da conta empresarial, por meio da qual eram movimentadas as receitas do estabelecimento, sob a genérica invocação de “medidas de segurança”, comprometeu a organização financeira do negócio e atingiu sua honra objetiva.</w:t>
-      </w:r>
-    </w:p>
-    <w:p>
-      <w:pPr>
-        <w:spacing w:after="60" w:line="360"/>
-        <w:ind w:firstLine="850"/>
-        <w:jc w:val="both"/>
-      </w:pPr>
-      <w:r>
-        <w:t xml:space="preserve">Considerando a duração da retenção, a recusa injustificada em resolver o problema na via administrativa, a capacidade econômica das partes e o caráter pedagógico da condenação, mostra-se razoável a fixação da indenização em </w:t>
-      </w:r>
-      <w:r>
-        <w:rPr>
-          <w:b/>
-          <w:bCs/>
-          <w:u w:val="single"/>
-          <w:shd w:fill="CFE2F3" w:color="auto" w:val="clear"/>
-        </w:rPr>
-        <w:t xml:space="preserve">R$ 5.000,00 (cinco mil reais) para cada autor</w:t>
-      </w:r>
-      <w:r>
-        <w:t xml:space="preserve">, totalizando R$ 10.000,00 (dez mil reais).</w:t>
+        <w:t xml:space="preserve">O bloqueio súbito, sob a genérica invocação de “medidas de segurança”, atingiu também a atividade comercial da qual o autor tira seu sustento, comprometendo a organização financeira do negócio.</w:t>
+      </w:r>
+    </w:p>
+    <w:p>
+      <w:pPr>
+        <w:spacing w:after="60" w:line="360"/>
+        <w:ind w:firstLine="850"/>
+        <w:jc w:val="both"/>
+      </w:pPr>
+      <w:r>
+        <w:t xml:space="preserve">Considerando a duração da retenção, que já se aproxima de dois anos, a recusa injustificada em resolver o problema na via administrativa, a dupla repercussão (pessoal e na atividade comercial do autor), a capacidade econômica da ré e o caráter pedagógico da condenação, mostra-se razoável a fixação da indenização em </w:t>
+      </w:r>
+      <w:r>
+        <w:rPr>
+          <w:b/>
+          <w:bCs/>
+          <w:u w:val="single"/>
+          <w:shd w:fill="CFE2F3" w:color="auto" w:val="clear"/>
+        </w:rPr>
+        <w:t xml:space="preserve">R$ 10.000,00 (dez mil reais)</w:t>
+      </w:r>
+      <w:r>
+        <w:t xml:space="preserve">.</w:t>
       </w:r>
     </w:p>
     <w:p>
@@ -1204,7 +1232,7 @@
         <w:jc w:val="both"/>
       </w:pPr>
       <w:r>
-        <w:t xml:space="preserve">Estão presentes os requisitos do art. 300 do CPC. A probabilidade do direito decorre da titularidade dos valores, que constituem patrimônio separado do da ré (art. 12 da Lei nº 12.865/2013), da inexistência de qualquer débito dos autores e da própria resposta da ré ao PROCON, que não aponta conduta concreta e admite não haver previsão de desbloqueio.</w:t>
+        <w:t xml:space="preserve">Estão presentes os requisitos do art. 300 do CPC. A probabilidade do direito decorre da titularidade dos valores, que constituem patrimônio separado do da ré (art. 12 da Lei nº 12.865/2013), da inexistência de qualquer débito do autor e da própria resposta da ré ao PROCON, que não aponta conduta concreta e admite não haver previsão de desbloqueio.</w:t>
       </w:r>
     </w:p>
     <w:p>
@@ -1224,7 +1252,7 @@
         <w:jc w:val="both"/>
       </w:pPr>
       <w:r>
-        <w:t xml:space="preserve">Requer-se, assim, a concessão de tutela de urgência para determinar que a ré, no prazo de 5 (cinco) dias: (i) apresente nos autos os extratos completos das duas contas e informe o saldo existente em cada uma em 04/11/2024; e (ii) deposite judicialmente os valores apurados ou os transfira para conta indicada pelos autores, sob pena de multa diária a ser fixada por Vossa Excelência (art. 84, § 4º, do CDC e art. 537 do CPC).</w:t>
+        <w:t xml:space="preserve">Requer-se, assim, a concessão de tutela de urgência para determinar que a ré, no prazo de 5 (cinco) dias: (i) apresente nos autos os extratos completos das duas contas do autor e informe o saldo existente em cada uma em 04/11/2024; e (ii) deposite judicialmente os valores apurados ou os transfira para conta indicada pelo autor, sob pena de multa diária a ser fixada por Vossa Excelência (art. 84, § 4º, do CDC e art. 537 do CPC).</w:t>
       </w:r>
     </w:p>
     <w:p>
@@ -1254,7 +1282,7 @@
         <w:jc w:val="both"/>
       </w:pPr>
       <w:r>
-        <w:t xml:space="preserve">Ante o exposto, requerem a Vossa Excelência:</w:t>
+        <w:t xml:space="preserve">Ante o exposto, requer a Vossa Excelência:</w:t>
       </w:r>
     </w:p>
     <w:p>
@@ -1270,7 +1298,7 @@
         <w:t xml:space="preserve">A.	</w:t>
       </w:r>
       <w:r>
-        <w:t xml:space="preserve">a concessão da tutela de urgência, para determinar que a ré, no prazo de 5 (cinco) dias, apresente os extratos completos das contas de pessoa física e de pessoa jurídica dos autores, informe o saldo existente em cada uma em 04/11/2024 e deposite judicialmente os valores apurados, ou os transfira para conta indicada pelos autores, sob pena de multa diária;</w:t>
+        <w:t xml:space="preserve">a concessão da gratuidade da justiça (arts. 98 e 99 do CPC);</w:t>
       </w:r>
     </w:p>
     <w:p>
@@ -1286,7 +1314,7 @@
         <w:t xml:space="preserve">B.	</w:t>
       </w:r>
       <w:r>
-        <w:t xml:space="preserve">a citação da ré, por via postal com aviso de recebimento ou por meio eletrônico, para comparecer à audiência de conciliação, preferencialmente por videoconferência (art. 22, § 2º, da Lei nº 9.099/1995), e, querendo, apresentar defesa, sob pena de revelia;</w:t>
+        <w:t xml:space="preserve">a concessão da tutela de urgência, para determinar que a ré, no prazo de 5 (cinco) dias, apresente os extratos completos da conta de pessoa física do autor e da conta vinculada ao CNPJ nº 42.828.031/0001-85, informe o saldo existente em cada uma em 04/11/2024 e deposite judicialmente os valores apurados, ou os transfira para conta indicada pelo autor, sob pena de multa diária;</w:t>
       </w:r>
     </w:p>
     <w:p>
@@ -1302,7 +1330,7 @@
         <w:t xml:space="preserve">C.	</w:t>
       </w:r>
       <w:r>
-        <w:t xml:space="preserve">o reconhecimento da relação de consumo, inclusive quanto à segunda autora, e a inversão do ônus da prova (art. 6º, VIII, do CDC);</w:t>
+        <w:t xml:space="preserve">a citação da ré, por meio eletrônico ou por via postal com aviso de recebimento, para comparecer à audiência de conciliação, preferencialmente por videoconferência (art. 334, § 7º, do CPC), e, querendo, apresentar contestação, sob pena de revelia;</w:t>
       </w:r>
     </w:p>
     <w:p>
@@ -1318,6 +1346,22 @@
         <w:t xml:space="preserve">D.	</w:t>
       </w:r>
       <w:r>
+        <w:t xml:space="preserve">o reconhecimento da relação de consumo e a inversão do ônus da prova (art. 6º, VIII, do CDC);</w:t>
+      </w:r>
+    </w:p>
+    <w:p>
+      <w:pPr>
+        <w:tabs>
+          <w:tab w:val="left" w:pos="1000"/>
+        </w:tabs>
+        <w:spacing w:after="60" w:line="360"/>
+        <w:ind w:left="1000" w:hanging="400"/>
+        <w:jc w:val="both"/>
+      </w:pPr>
+      <w:r>
+        <w:t xml:space="preserve">E.	</w:t>
+      </w:r>
+      <w:r>
         <w:t xml:space="preserve">a intimação da ré para exibir os extratos completos das duas contas, desde a abertura até o encerramento, e os documentos relativos ao bloqueio e ao encerramento, sob as penas do art. 400 do CPC;</w:t>
       </w:r>
     </w:p>
@@ -1331,10 +1375,10 @@
         <w:jc w:val="both"/>
       </w:pPr>
       <w:r>
-        <w:t xml:space="preserve">E.	</w:t>
-      </w:r>
-      <w:r>
-        <w:t xml:space="preserve">no mérito, a confirmação da tutela de urgência e a condenação da ré a restituir aos autores a integralidade dos saldos existentes nas contas na data do encerramento, em valor a ser apurado com base nos extratos e estimado em R$ 3.500,00 (três mil e quinhentos reais), com correção monetária desde 04/11/2024 e juros de mora desde a citação;</w:t>
+        <w:t xml:space="preserve">F.	</w:t>
+      </w:r>
+      <w:r>
+        <w:t xml:space="preserve">no mérito, a confirmação da tutela de urgência e a condenação da ré a restituir ao autor a integralidade dos saldos existentes nas duas contas na data do encerramento, em valor a ser apurado com base nos extratos e estimado em R$ 3.500,00 (três mil e quinhentos reais), com correção monetária desde 04/11/2024 e juros de mora desde a citação;</w:t>
       </w:r>
     </w:p>
     <w:p>
@@ -1347,10 +1391,10 @@
         <w:jc w:val="both"/>
       </w:pPr>
       <w:r>
-        <w:t xml:space="preserve">F.	</w:t>
-      </w:r>
-      <w:r>
-        <w:t xml:space="preserve">a condenação da ré ao pagamento de indenização por danos morais no valor de R$ 5.000,00 (cinco mil reais) ao primeiro autor e de R$ 5.000,00 (cinco mil reais) à segunda autora, com correção monetária desde o arbitramento (Súmula 362 do STJ) e juros de mora desde a citação;</w:t>
+        <w:t xml:space="preserve">G.	</w:t>
+      </w:r>
+      <w:r>
+        <w:t xml:space="preserve">a condenação da ré ao pagamento de indenização por danos morais no valor de R$ 10.000,00 (dez mil reais), com correção monetária desde o arbitramento (Súmula 362 do STJ) e juros de mora desde a citação;</w:t>
       </w:r>
     </w:p>
     <w:p>
@@ -1363,20 +1407,20 @@
         <w:jc w:val="both"/>
       </w:pPr>
       <w:r>
-        <w:t xml:space="preserve">G.	</w:t>
-      </w:r>
-      <w:r>
-        <w:t xml:space="preserve">em caso de recurso, a condenação da ré ao pagamento de custas e honorários advocatícios, nos termos do art. 55 da Lei nº 9.099/1995.</w:t>
-      </w:r>
-    </w:p>
-    <w:p>
-      <w:pPr>
-        <w:spacing w:after="60" w:line="360"/>
-        <w:ind w:firstLine="850"/>
-        <w:jc w:val="both"/>
-      </w:pPr>
-      <w:r>
-        <w:t xml:space="preserve">Protestam os autores pela produção de todos os meios de prova admitidos em direito, em especial a prova documental acostada a esta inicial, a exibição de documentos acima requerida e o depoimento pessoal do representante da ré.</w:t>
+        <w:t xml:space="preserve">H.	</w:t>
+      </w:r>
+      <w:r>
+        <w:t xml:space="preserve">a condenação da ré ao pagamento das custas processuais e de honorários advocatícios de 20% (vinte por cento) sobre o valor da condenação (art. 85, § 2º, do CPC) ou, caso esse montante se revele irrisório, fixados por apreciação equitativa, observados os valores recomendados pela tabela da OAB-PI (art. 85, §§ 8º e 8º-A, do CPC).</w:t>
+      </w:r>
+    </w:p>
+    <w:p>
+      <w:pPr>
+        <w:spacing w:after="60" w:line="360"/>
+        <w:ind w:firstLine="850"/>
+        <w:jc w:val="both"/>
+      </w:pPr>
+      <w:r>
+        <w:t xml:space="preserve">Protesta o autor pela produção de todos os meios de prova admitidos em direito, em especial a prova documental acostada a esta inicial, a exibição de documentos acima requerida e o depoimento pessoal do representante da ré.</w:t>
       </w:r>
     </w:p>
     <w:p>
@@ -1398,7 +1442,7 @@
         <w:t xml:space="preserve">R$ 13.500,00 (treze mil e quinhentos reais)</w:t>
       </w:r>
       <w:r>
-        <w:t xml:space="preserve">, correspondente à soma do valor estimado dos saldos e das indenizações pretendidas (art. 292, VI, do CPC).</w:t>
+        <w:t xml:space="preserve">, correspondente à soma do valor estimado dos saldos e da indenização pretendida (art. 292, VI, do CPC).</w:t>
       </w:r>
     </w:p>
     <w:p>
@@ -1424,7 +1468,7 @@
           <w:szCs w:val="22"/>
           <w:shd w:fill="FFF200" w:color="auto" w:val="clear"/>
         </w:rPr>
-        <w:t xml:space="preserve">[Doc. 01 – Procurações (pessoa física e pessoa jurídica);]</w:t>
+        <w:t xml:space="preserve">[Doc. 01 – Procuração e declaração de hipossuficiência;]</w:t>
       </w:r>
     </w:p>
     <w:p>
@@ -1472,7 +1516,7 @@
           <w:szCs w:val="22"/>
           <w:shd w:fill="FFF200" w:color="auto" w:val="clear"/>
         </w:rPr>
-        <w:t xml:space="preserve">[Doc. 04 – Comprovante de inscrição no CNPJ e requerimento de empresário;]</w:t>
+        <w:t xml:space="preserve">[Doc. 04 – Comprovante de inscrição no CNPJ da firma individual (Pedro Acelino e Moura ME);]</w:t>
       </w:r>
     </w:p>
     <w:p>

</xml_diff>